<commit_message>
Adiciona capítulo Glossário e Siglas ao Product Report do Égide Vita
Último capítulo do documento, em ordem alfabética: 22 termos cobrindo
os indicadores de saúde digital (Vamping, IRE, Burnout/Presenteísmo
Digital etc.), os modelos matemáticos (Markov absorvente, Brandes,
JSD, HHI, Teoria de Rede da Psicopatologia) e os frameworks
normativos (ECA Digital — Lei nº 15.211/2025, NR-1, Marco Legal da
IA, PBIA) — verificados contra egide-vita/index.html.
</commit_message>
<xml_diff>
--- a/docs/produtos/egide-vita-product-report.docx
+++ b/docs/produtos/egide-vita-product-report.docx
@@ -422,6 +422,31 @@
           <w:szCs w:val="22"/>
         </w:rPr>
         <w:t xml:space="preserve">	11</w:t>
+      </w:r>
+    </w:p>
+    <w:p>
+      <w:pPr>
+        <w:tabs>
+          <w:tab w:val="right" w:pos="9026" w:leader="dot"/>
+        </w:tabs>
+        <w:spacing w:after="100"/>
+        <w:ind w:left="0"/>
+      </w:pPr>
+      <w:r>
+        <w:rPr>
+          <w:b/>
+          <w:bCs/>
+          <w:sz w:val="22"/>
+          <w:szCs w:val="22"/>
+        </w:rPr>
+        <w:t xml:space="preserve">Glossário e Siglas</w:t>
+      </w:r>
+      <w:r>
+        <w:rPr>
+          <w:sz w:val="22"/>
+          <w:szCs w:val="22"/>
+        </w:rPr>
+        <w:t xml:space="preserve">	12</w:t>
       </w:r>
     </w:p>
     <w:p>
@@ -6310,6 +6335,2482 @@
         </w:tc>
       </w:tr>
     </w:tbl>
+    <w:p>
+      <w:pPr>
+        <w:pStyle w:val="Heading1"/>
+      </w:pPr>
+      <w:r>
+        <w:t xml:space="preserve">Glossário e Siglas</w:t>
+      </w:r>
+    </w:p>
+    <w:p>
+      <w:pPr>
+        <w:spacing w:after="200" w:before="0"/>
+        <w:jc w:val="both"/>
+      </w:pPr>
+      <w:r>
+        <w:rPr>
+          <w:b w:val="false"/>
+          <w:bCs w:val="false"/>
+          <w:i w:val="false"/>
+          <w:iCs w:val="false"/>
+        </w:rPr>
+        <w:t xml:space="preserve">Consolida, em ordem alfabética, os indicadores de saúde digital, os modelos matemáticos (Markov absorvente, Brandes, JSD, HHI) e os frameworks normativos (ECA Digital, NR-1, Marco Legal da IA, PBIA) efetivamente citados no corpus técnico do Égide Vita.</w:t>
+      </w:r>
+    </w:p>
+    <w:tbl>
+      <w:tblPr>
+        <w:tblW w:type="dxa" w:w="9360"/>
+        <w:tblBorders>
+          <w:top w:val="single" w:color="auto" w:sz="4"/>
+          <w:left w:val="single" w:color="auto" w:sz="4"/>
+          <w:bottom w:val="single" w:color="auto" w:sz="4"/>
+          <w:right w:val="single" w:color="auto" w:sz="4"/>
+          <w:insideH w:val="single" w:color="auto" w:sz="4"/>
+          <w:insideV w:val="single" w:color="auto" w:sz="4"/>
+        </w:tblBorders>
+      </w:tblPr>
+      <w:tblGrid>
+        <w:gridCol w:w="2100"/>
+        <w:gridCol w:w="1500"/>
+        <w:gridCol w:w="5760"/>
+      </w:tblGrid>
+      <w:tr>
+        <w:tc>
+          <w:tcPr>
+            <w:tcW w:type="dxa" w:w="2100"/>
+            <w:tcBorders>
+              <w:top w:val="single" w:color="CCCCCC" w:sz="4"/>
+              <w:left w:val="single" w:color="CCCCCC" w:sz="4"/>
+              <w:bottom w:val="single" w:color="CCCCCC" w:sz="4"/>
+              <w:right w:val="single" w:color="CCCCCC" w:sz="4"/>
+            </w:tcBorders>
+            <w:shd w:fill="1F4E79" w:val="clear"/>
+            <w:tcMar>
+              <w:top w:type="dxa" w:w="100"/>
+              <w:left w:type="dxa" w:w="120"/>
+              <w:bottom w:type="dxa" w:w="100"/>
+              <w:right w:type="dxa" w:w="120"/>
+            </w:tcMar>
+            <w:vAlign w:val="center"/>
+          </w:tcPr>
+          <w:p>
+            <w:pPr>
+              <w:jc w:val="left"/>
+            </w:pPr>
+            <w:r>
+              <w:rPr>
+                <w:b/>
+                <w:bCs/>
+                <w:i w:val="false"/>
+                <w:iCs w:val="false"/>
+                <w:color w:val="FFFFFF"/>
+                <w:sz w:val="19"/>
+                <w:szCs w:val="19"/>
+              </w:rPr>
+              <w:t xml:space="preserve">Termo</w:t>
+            </w:r>
+          </w:p>
+        </w:tc>
+        <w:tc>
+          <w:tcPr>
+            <w:tcW w:type="dxa" w:w="1500"/>
+            <w:tcBorders>
+              <w:top w:val="single" w:color="CCCCCC" w:sz="4"/>
+              <w:left w:val="single" w:color="CCCCCC" w:sz="4"/>
+              <w:bottom w:val="single" w:color="CCCCCC" w:sz="4"/>
+              <w:right w:val="single" w:color="CCCCCC" w:sz="4"/>
+            </w:tcBorders>
+            <w:shd w:fill="1F4E79" w:val="clear"/>
+            <w:tcMar>
+              <w:top w:type="dxa" w:w="100"/>
+              <w:left w:type="dxa" w:w="120"/>
+              <w:bottom w:type="dxa" w:w="100"/>
+              <w:right w:type="dxa" w:w="120"/>
+            </w:tcMar>
+            <w:vAlign w:val="center"/>
+          </w:tcPr>
+          <w:p>
+            <w:pPr>
+              <w:jc w:val="left"/>
+            </w:pPr>
+            <w:r>
+              <w:rPr>
+                <w:b/>
+                <w:bCs/>
+                <w:i w:val="false"/>
+                <w:iCs w:val="false"/>
+                <w:color w:val="FFFFFF"/>
+                <w:sz w:val="19"/>
+                <w:szCs w:val="19"/>
+              </w:rPr>
+              <w:t xml:space="preserve">Categoria</w:t>
+            </w:r>
+          </w:p>
+        </w:tc>
+        <w:tc>
+          <w:tcPr>
+            <w:tcW w:type="dxa" w:w="5760"/>
+            <w:tcBorders>
+              <w:top w:val="single" w:color="CCCCCC" w:sz="4"/>
+              <w:left w:val="single" w:color="CCCCCC" w:sz="4"/>
+              <w:bottom w:val="single" w:color="CCCCCC" w:sz="4"/>
+              <w:right w:val="single" w:color="CCCCCC" w:sz="4"/>
+            </w:tcBorders>
+            <w:shd w:fill="1F4E79" w:val="clear"/>
+            <w:tcMar>
+              <w:top w:type="dxa" w:w="100"/>
+              <w:left w:type="dxa" w:w="120"/>
+              <w:bottom w:type="dxa" w:w="100"/>
+              <w:right w:type="dxa" w:w="120"/>
+            </w:tcMar>
+            <w:vAlign w:val="center"/>
+          </w:tcPr>
+          <w:p>
+            <w:pPr>
+              <w:jc w:val="left"/>
+            </w:pPr>
+            <w:r>
+              <w:rPr>
+                <w:b/>
+                <w:bCs/>
+                <w:i w:val="false"/>
+                <w:iCs w:val="false"/>
+                <w:color w:val="FFFFFF"/>
+                <w:sz w:val="19"/>
+                <w:szCs w:val="19"/>
+              </w:rPr>
+              <w:t xml:space="preserve">Definição</w:t>
+            </w:r>
+          </w:p>
+        </w:tc>
+      </w:tr>
+      <w:tr>
+        <w:tc>
+          <w:tcPr>
+            <w:tcW w:type="dxa" w:w="2100"/>
+            <w:tcBorders>
+              <w:top w:val="single" w:color="CCCCCC" w:sz="4"/>
+              <w:left w:val="single" w:color="CCCCCC" w:sz="4"/>
+              <w:bottom w:val="single" w:color="CCCCCC" w:sz="4"/>
+              <w:right w:val="single" w:color="CCCCCC" w:sz="4"/>
+            </w:tcBorders>
+            <w:tcMar>
+              <w:top w:type="dxa" w:w="100"/>
+              <w:left w:type="dxa" w:w="120"/>
+              <w:bottom w:type="dxa" w:w="100"/>
+              <w:right w:type="dxa" w:w="120"/>
+            </w:tcMar>
+            <w:vAlign w:val="center"/>
+          </w:tcPr>
+          <w:p>
+            <w:pPr>
+              <w:jc w:val="left"/>
+            </w:pPr>
+            <w:r>
+              <w:rPr>
+                <w:b/>
+                <w:bCs/>
+                <w:i w:val="false"/>
+                <w:iCs w:val="false"/>
+                <w:sz w:val="19"/>
+                <w:szCs w:val="19"/>
+              </w:rPr>
+              <w:t xml:space="preserve">Apostas Online (Bets)</w:t>
+            </w:r>
+          </w:p>
+        </w:tc>
+        <w:tc>
+          <w:tcPr>
+            <w:tcW w:type="dxa" w:w="1500"/>
+            <w:tcBorders>
+              <w:top w:val="single" w:color="CCCCCC" w:sz="4"/>
+              <w:left w:val="single" w:color="CCCCCC" w:sz="4"/>
+              <w:bottom w:val="single" w:color="CCCCCC" w:sz="4"/>
+              <w:right w:val="single" w:color="CCCCCC" w:sz="4"/>
+            </w:tcBorders>
+            <w:tcMar>
+              <w:top w:type="dxa" w:w="100"/>
+              <w:left w:type="dxa" w:w="120"/>
+              <w:bottom w:type="dxa" w:w="100"/>
+              <w:right w:type="dxa" w:w="120"/>
+            </w:tcMar>
+            <w:vAlign w:val="center"/>
+          </w:tcPr>
+          <w:p>
+            <w:pPr>
+              <w:jc w:val="left"/>
+            </w:pPr>
+            <w:r>
+              <w:rPr>
+                <w:b w:val="false"/>
+                <w:bCs w:val="false"/>
+                <w:i w:val="false"/>
+                <w:iCs w:val="false"/>
+                <w:color w:val="4A6A8A"/>
+                <w:sz w:val="19"/>
+                <w:szCs w:val="19"/>
+              </w:rPr>
+              <w:t xml:space="preserve">Indicador</w:t>
+            </w:r>
+          </w:p>
+        </w:tc>
+        <w:tc>
+          <w:tcPr>
+            <w:tcW w:type="dxa" w:w="5760"/>
+            <w:tcBorders>
+              <w:top w:val="single" w:color="CCCCCC" w:sz="4"/>
+              <w:left w:val="single" w:color="CCCCCC" w:sz="4"/>
+              <w:bottom w:val="single" w:color="CCCCCC" w:sz="4"/>
+              <w:right w:val="single" w:color="CCCCCC" w:sz="4"/>
+            </w:tcBorders>
+            <w:tcMar>
+              <w:top w:type="dxa" w:w="100"/>
+              <w:left w:type="dxa" w:w="120"/>
+              <w:bottom w:type="dxa" w:w="100"/>
+              <w:right w:type="dxa" w:w="120"/>
+            </w:tcMar>
+            <w:vAlign w:val="center"/>
+          </w:tcPr>
+          <w:p>
+            <w:pPr>
+              <w:jc w:val="left"/>
+            </w:pPr>
+            <w:r>
+              <w:rPr>
+                <w:b w:val="false"/>
+                <w:bCs w:val="false"/>
+                <w:i w:val="false"/>
+                <w:iCs w:val="false"/>
+                <w:sz w:val="19"/>
+                <w:szCs w:val="19"/>
+              </w:rPr>
+              <w:t xml:space="preserve">Nó comportamental do Dígrafo Sindrômico com a maior P(Crise) estrutural entre os satélites (60,6%).</w:t>
+            </w:r>
+          </w:p>
+        </w:tc>
+      </w:tr>
+      <w:tr>
+        <w:tc>
+          <w:tcPr>
+            <w:tcW w:type="dxa" w:w="2100"/>
+            <w:tcBorders>
+              <w:top w:val="single" w:color="CCCCCC" w:sz="4"/>
+              <w:left w:val="single" w:color="CCCCCC" w:sz="4"/>
+              <w:bottom w:val="single" w:color="CCCCCC" w:sz="4"/>
+              <w:right w:val="single" w:color="CCCCCC" w:sz="4"/>
+            </w:tcBorders>
+            <w:tcMar>
+              <w:top w:type="dxa" w:w="100"/>
+              <w:left w:type="dxa" w:w="120"/>
+              <w:bottom w:type="dxa" w:w="100"/>
+              <w:right w:type="dxa" w:w="120"/>
+            </w:tcMar>
+            <w:vAlign w:val="center"/>
+          </w:tcPr>
+          <w:p>
+            <w:pPr>
+              <w:jc w:val="left"/>
+            </w:pPr>
+            <w:r>
+              <w:rPr>
+                <w:b/>
+                <w:bCs/>
+                <w:i w:val="false"/>
+                <w:iCs w:val="false"/>
+                <w:sz w:val="19"/>
+                <w:szCs w:val="19"/>
+              </w:rPr>
+              <w:t xml:space="preserve">BASE_AFFINITY</w:t>
+            </w:r>
+          </w:p>
+        </w:tc>
+        <w:tc>
+          <w:tcPr>
+            <w:tcW w:type="dxa" w:w="1500"/>
+            <w:tcBorders>
+              <w:top w:val="single" w:color="CCCCCC" w:sz="4"/>
+              <w:left w:val="single" w:color="CCCCCC" w:sz="4"/>
+              <w:bottom w:val="single" w:color="CCCCCC" w:sz="4"/>
+              <w:right w:val="single" w:color="CCCCCC" w:sz="4"/>
+            </w:tcBorders>
+            <w:tcMar>
+              <w:top w:type="dxa" w:w="100"/>
+              <w:left w:type="dxa" w:w="120"/>
+              <w:bottom w:type="dxa" w:w="100"/>
+              <w:right w:type="dxa" w:w="120"/>
+            </w:tcMar>
+            <w:vAlign w:val="center"/>
+          </w:tcPr>
+          <w:p>
+            <w:pPr>
+              <w:jc w:val="left"/>
+            </w:pPr>
+            <w:r>
+              <w:rPr>
+                <w:b w:val="false"/>
+                <w:bCs w:val="false"/>
+                <w:i w:val="false"/>
+                <w:iCs w:val="false"/>
+                <w:color w:val="4A6A8A"/>
+                <w:sz w:val="19"/>
+                <w:szCs w:val="19"/>
+              </w:rPr>
+              <w:t xml:space="preserve">Modelo/Técnica</w:t>
+            </w:r>
+          </w:p>
+        </w:tc>
+        <w:tc>
+          <w:tcPr>
+            <w:tcW w:type="dxa" w:w="5760"/>
+            <w:tcBorders>
+              <w:top w:val="single" w:color="CCCCCC" w:sz="4"/>
+              <w:left w:val="single" w:color="CCCCCC" w:sz="4"/>
+              <w:bottom w:val="single" w:color="CCCCCC" w:sz="4"/>
+              <w:right w:val="single" w:color="CCCCCC" w:sz="4"/>
+            </w:tcBorders>
+            <w:tcMar>
+              <w:top w:type="dxa" w:w="100"/>
+              <w:left w:type="dxa" w:w="120"/>
+              <w:bottom w:type="dxa" w:w="100"/>
+              <w:right w:type="dxa" w:w="120"/>
+            </w:tcMar>
+            <w:vAlign w:val="center"/>
+          </w:tcPr>
+          <w:p>
+            <w:pPr>
+              <w:jc w:val="left"/>
+            </w:pPr>
+            <w:r>
+              <w:rPr>
+                <w:b w:val="false"/>
+                <w:bCs w:val="false"/>
+                <w:i w:val="false"/>
+                <w:iCs w:val="false"/>
+                <w:sz w:val="19"/>
+                <w:szCs w:val="19"/>
+              </w:rPr>
+              <w:t xml:space="preserve">Matriz de afinidade de transição fixa entre os 7 nós comportamentais + 2 estados absorventes — igual para todos os cohorts; só o fator de escalonamento muda por cohort/semana.</w:t>
+            </w:r>
+          </w:p>
+        </w:tc>
+      </w:tr>
+      <w:tr>
+        <w:tc>
+          <w:tcPr>
+            <w:tcW w:type="dxa" w:w="2100"/>
+            <w:tcBorders>
+              <w:top w:val="single" w:color="CCCCCC" w:sz="4"/>
+              <w:left w:val="single" w:color="CCCCCC" w:sz="4"/>
+              <w:bottom w:val="single" w:color="CCCCCC" w:sz="4"/>
+              <w:right w:val="single" w:color="CCCCCC" w:sz="4"/>
+            </w:tcBorders>
+            <w:tcMar>
+              <w:top w:type="dxa" w:w="100"/>
+              <w:left w:type="dxa" w:w="120"/>
+              <w:bottom w:type="dxa" w:w="100"/>
+              <w:right w:type="dxa" w:w="120"/>
+            </w:tcMar>
+            <w:vAlign w:val="center"/>
+          </w:tcPr>
+          <w:p>
+            <w:pPr>
+              <w:jc w:val="left"/>
+            </w:pPr>
+            <w:r>
+              <w:rPr>
+                <w:b/>
+                <w:bCs/>
+                <w:i w:val="false"/>
+                <w:iCs w:val="false"/>
+                <w:sz w:val="19"/>
+                <w:szCs w:val="19"/>
+              </w:rPr>
+              <w:t xml:space="preserve">Binge Watching</w:t>
+            </w:r>
+          </w:p>
+        </w:tc>
+        <w:tc>
+          <w:tcPr>
+            <w:tcW w:type="dxa" w:w="1500"/>
+            <w:tcBorders>
+              <w:top w:val="single" w:color="CCCCCC" w:sz="4"/>
+              <w:left w:val="single" w:color="CCCCCC" w:sz="4"/>
+              <w:bottom w:val="single" w:color="CCCCCC" w:sz="4"/>
+              <w:right w:val="single" w:color="CCCCCC" w:sz="4"/>
+            </w:tcBorders>
+            <w:tcMar>
+              <w:top w:type="dxa" w:w="100"/>
+              <w:left w:type="dxa" w:w="120"/>
+              <w:bottom w:type="dxa" w:w="100"/>
+              <w:right w:type="dxa" w:w="120"/>
+            </w:tcMar>
+            <w:vAlign w:val="center"/>
+          </w:tcPr>
+          <w:p>
+            <w:pPr>
+              <w:jc w:val="left"/>
+            </w:pPr>
+            <w:r>
+              <w:rPr>
+                <w:b w:val="false"/>
+                <w:bCs w:val="false"/>
+                <w:i w:val="false"/>
+                <w:iCs w:val="false"/>
+                <w:color w:val="4A6A8A"/>
+                <w:sz w:val="19"/>
+                <w:szCs w:val="19"/>
+              </w:rPr>
+              <w:t xml:space="preserve">Indicador</w:t>
+            </w:r>
+          </w:p>
+        </w:tc>
+        <w:tc>
+          <w:tcPr>
+            <w:tcW w:type="dxa" w:w="5760"/>
+            <w:tcBorders>
+              <w:top w:val="single" w:color="CCCCCC" w:sz="4"/>
+              <w:left w:val="single" w:color="CCCCCC" w:sz="4"/>
+              <w:bottom w:val="single" w:color="CCCCCC" w:sz="4"/>
+              <w:right w:val="single" w:color="CCCCCC" w:sz="4"/>
+            </w:tcBorders>
+            <w:tcMar>
+              <w:top w:type="dxa" w:w="100"/>
+              <w:left w:type="dxa" w:w="120"/>
+              <w:bottom w:type="dxa" w:w="100"/>
+              <w:right w:type="dxa" w:w="120"/>
+            </w:tcMar>
+            <w:vAlign w:val="center"/>
+          </w:tcPr>
+          <w:p>
+            <w:pPr>
+              <w:jc w:val="left"/>
+            </w:pPr>
+            <w:r>
+              <w:rPr>
+                <w:b w:val="false"/>
+                <w:bCs w:val="false"/>
+                <w:i w:val="false"/>
+                <w:iCs w:val="false"/>
+                <w:sz w:val="19"/>
+                <w:szCs w:val="19"/>
+              </w:rPr>
+              <w:t xml:space="preserve">Nó comportamental de sessões prolongadas de streaming/gaming.</w:t>
+            </w:r>
+          </w:p>
+        </w:tc>
+      </w:tr>
+      <w:tr>
+        <w:tc>
+          <w:tcPr>
+            <w:tcW w:type="dxa" w:w="2100"/>
+            <w:tcBorders>
+              <w:top w:val="single" w:color="CCCCCC" w:sz="4"/>
+              <w:left w:val="single" w:color="CCCCCC" w:sz="4"/>
+              <w:bottom w:val="single" w:color="CCCCCC" w:sz="4"/>
+              <w:right w:val="single" w:color="CCCCCC" w:sz="4"/>
+            </w:tcBorders>
+            <w:tcMar>
+              <w:top w:type="dxa" w:w="100"/>
+              <w:left w:type="dxa" w:w="120"/>
+              <w:bottom w:type="dxa" w:w="100"/>
+              <w:right w:type="dxa" w:w="120"/>
+            </w:tcMar>
+            <w:vAlign w:val="center"/>
+          </w:tcPr>
+          <w:p>
+            <w:pPr>
+              <w:jc w:val="left"/>
+            </w:pPr>
+            <w:r>
+              <w:rPr>
+                <w:b/>
+                <w:bCs/>
+                <w:i w:val="false"/>
+                <w:iCs w:val="false"/>
+                <w:sz w:val="19"/>
+                <w:szCs w:val="19"/>
+              </w:rPr>
+              <w:t xml:space="preserve">Brandes (Centralidade de Intermediação)</w:t>
+            </w:r>
+          </w:p>
+        </w:tc>
+        <w:tc>
+          <w:tcPr>
+            <w:tcW w:type="dxa" w:w="1500"/>
+            <w:tcBorders>
+              <w:top w:val="single" w:color="CCCCCC" w:sz="4"/>
+              <w:left w:val="single" w:color="CCCCCC" w:sz="4"/>
+              <w:bottom w:val="single" w:color="CCCCCC" w:sz="4"/>
+              <w:right w:val="single" w:color="CCCCCC" w:sz="4"/>
+            </w:tcBorders>
+            <w:tcMar>
+              <w:top w:type="dxa" w:w="100"/>
+              <w:left w:type="dxa" w:w="120"/>
+              <w:bottom w:type="dxa" w:w="100"/>
+              <w:right w:type="dxa" w:w="120"/>
+            </w:tcMar>
+            <w:vAlign w:val="center"/>
+          </w:tcPr>
+          <w:p>
+            <w:pPr>
+              <w:jc w:val="left"/>
+            </w:pPr>
+            <w:r>
+              <w:rPr>
+                <w:b w:val="false"/>
+                <w:bCs w:val="false"/>
+                <w:i w:val="false"/>
+                <w:iCs w:val="false"/>
+                <w:color w:val="4A6A8A"/>
+                <w:sz w:val="19"/>
+                <w:szCs w:val="19"/>
+              </w:rPr>
+              <w:t xml:space="preserve">Modelo/Técnica</w:t>
+            </w:r>
+          </w:p>
+        </w:tc>
+        <w:tc>
+          <w:tcPr>
+            <w:tcW w:type="dxa" w:w="5760"/>
+            <w:tcBorders>
+              <w:top w:val="single" w:color="CCCCCC" w:sz="4"/>
+              <w:left w:val="single" w:color="CCCCCC" w:sz="4"/>
+              <w:bottom w:val="single" w:color="CCCCCC" w:sz="4"/>
+              <w:right w:val="single" w:color="CCCCCC" w:sz="4"/>
+            </w:tcBorders>
+            <w:tcMar>
+              <w:top w:type="dxa" w:w="100"/>
+              <w:left w:type="dxa" w:w="120"/>
+              <w:bottom w:type="dxa" w:w="100"/>
+              <w:right w:type="dxa" w:w="120"/>
+            </w:tcMar>
+            <w:vAlign w:val="center"/>
+          </w:tcPr>
+          <w:p>
+            <w:pPr>
+              <w:jc w:val="left"/>
+            </w:pPr>
+            <w:r>
+              <w:rPr>
+                <w:b w:val="false"/>
+                <w:bCs w:val="false"/>
+                <w:i w:val="false"/>
+                <w:iCs w:val="false"/>
+                <w:sz w:val="19"/>
+                <w:szCs w:val="19"/>
+              </w:rPr>
+              <w:t xml:space="preserve">Algoritmo eficiente O(VE) para calcular a centralidade de intermediação de todos os nós de um grafo; identifica papel topológico (Núcleo/Ponte/Âncora/Satélite).</w:t>
+            </w:r>
+          </w:p>
+        </w:tc>
+      </w:tr>
+      <w:tr>
+        <w:tc>
+          <w:tcPr>
+            <w:tcW w:type="dxa" w:w="2100"/>
+            <w:tcBorders>
+              <w:top w:val="single" w:color="CCCCCC" w:sz="4"/>
+              <w:left w:val="single" w:color="CCCCCC" w:sz="4"/>
+              <w:bottom w:val="single" w:color="CCCCCC" w:sz="4"/>
+              <w:right w:val="single" w:color="CCCCCC" w:sz="4"/>
+            </w:tcBorders>
+            <w:tcMar>
+              <w:top w:type="dxa" w:w="100"/>
+              <w:left w:type="dxa" w:w="120"/>
+              <w:bottom w:type="dxa" w:w="100"/>
+              <w:right w:type="dxa" w:w="120"/>
+            </w:tcMar>
+            <w:vAlign w:val="center"/>
+          </w:tcPr>
+          <w:p>
+            <w:pPr>
+              <w:jc w:val="left"/>
+            </w:pPr>
+            <w:r>
+              <w:rPr>
+                <w:b/>
+                <w:bCs/>
+                <w:i w:val="false"/>
+                <w:iCs w:val="false"/>
+                <w:sz w:val="19"/>
+                <w:szCs w:val="19"/>
+              </w:rPr>
+              <w:t xml:space="preserve">Burnout / Presenteísmo Digital</w:t>
+            </w:r>
+          </w:p>
+        </w:tc>
+        <w:tc>
+          <w:tcPr>
+            <w:tcW w:type="dxa" w:w="1500"/>
+            <w:tcBorders>
+              <w:top w:val="single" w:color="CCCCCC" w:sz="4"/>
+              <w:left w:val="single" w:color="CCCCCC" w:sz="4"/>
+              <w:bottom w:val="single" w:color="CCCCCC" w:sz="4"/>
+              <w:right w:val="single" w:color="CCCCCC" w:sz="4"/>
+            </w:tcBorders>
+            <w:tcMar>
+              <w:top w:type="dxa" w:w="100"/>
+              <w:left w:type="dxa" w:w="120"/>
+              <w:bottom w:type="dxa" w:w="100"/>
+              <w:right w:type="dxa" w:w="120"/>
+            </w:tcMar>
+            <w:vAlign w:val="center"/>
+          </w:tcPr>
+          <w:p>
+            <w:pPr>
+              <w:jc w:val="left"/>
+            </w:pPr>
+            <w:r>
+              <w:rPr>
+                <w:b w:val="false"/>
+                <w:bCs w:val="false"/>
+                <w:i w:val="false"/>
+                <w:iCs w:val="false"/>
+                <w:color w:val="4A6A8A"/>
+                <w:sz w:val="19"/>
+                <w:szCs w:val="19"/>
+              </w:rPr>
+              <w:t xml:space="preserve">Indicador</w:t>
+            </w:r>
+          </w:p>
+        </w:tc>
+        <w:tc>
+          <w:tcPr>
+            <w:tcW w:type="dxa" w:w="5760"/>
+            <w:tcBorders>
+              <w:top w:val="single" w:color="CCCCCC" w:sz="4"/>
+              <w:left w:val="single" w:color="CCCCCC" w:sz="4"/>
+              <w:bottom w:val="single" w:color="CCCCCC" w:sz="4"/>
+              <w:right w:val="single" w:color="CCCCCC" w:sz="4"/>
+            </w:tcBorders>
+            <w:tcMar>
+              <w:top w:type="dxa" w:w="100"/>
+              <w:left w:type="dxa" w:w="120"/>
+              <w:bottom w:type="dxa" w:w="100"/>
+              <w:right w:type="dxa" w:w="120"/>
+            </w:tcMar>
+            <w:vAlign w:val="center"/>
+          </w:tcPr>
+          <w:p>
+            <w:pPr>
+              <w:jc w:val="left"/>
+            </w:pPr>
+            <w:r>
+              <w:rPr>
+                <w:b w:val="false"/>
+                <w:bCs w:val="false"/>
+                <w:i w:val="false"/>
+                <w:iCs w:val="false"/>
+                <w:sz w:val="19"/>
+                <w:szCs w:val="19"/>
+              </w:rPr>
+              <w:t xml:space="preserve">Esgotamento por conectividade compulsória fora do expediente; indicador do cohort Corporativo/NR-1.</w:t>
+            </w:r>
+          </w:p>
+        </w:tc>
+      </w:tr>
+      <w:tr>
+        <w:tc>
+          <w:tcPr>
+            <w:tcW w:type="dxa" w:w="2100"/>
+            <w:tcBorders>
+              <w:top w:val="single" w:color="CCCCCC" w:sz="4"/>
+              <w:left w:val="single" w:color="CCCCCC" w:sz="4"/>
+              <w:bottom w:val="single" w:color="CCCCCC" w:sz="4"/>
+              <w:right w:val="single" w:color="CCCCCC" w:sz="4"/>
+            </w:tcBorders>
+            <w:tcMar>
+              <w:top w:type="dxa" w:w="100"/>
+              <w:left w:type="dxa" w:w="120"/>
+              <w:bottom w:type="dxa" w:w="100"/>
+              <w:right w:type="dxa" w:w="120"/>
+            </w:tcMar>
+            <w:vAlign w:val="center"/>
+          </w:tcPr>
+          <w:p>
+            <w:pPr>
+              <w:jc w:val="left"/>
+            </w:pPr>
+            <w:r>
+              <w:rPr>
+                <w:b/>
+                <w:bCs/>
+                <w:i w:val="false"/>
+                <w:iCs w:val="false"/>
+                <w:sz w:val="19"/>
+                <w:szCs w:val="19"/>
+              </w:rPr>
+              <w:t xml:space="preserve">CID-11 (ICD-11)</w:t>
+            </w:r>
+          </w:p>
+        </w:tc>
+        <w:tc>
+          <w:tcPr>
+            <w:tcW w:type="dxa" w:w="1500"/>
+            <w:tcBorders>
+              <w:top w:val="single" w:color="CCCCCC" w:sz="4"/>
+              <w:left w:val="single" w:color="CCCCCC" w:sz="4"/>
+              <w:bottom w:val="single" w:color="CCCCCC" w:sz="4"/>
+              <w:right w:val="single" w:color="CCCCCC" w:sz="4"/>
+            </w:tcBorders>
+            <w:tcMar>
+              <w:top w:type="dxa" w:w="100"/>
+              <w:left w:type="dxa" w:w="120"/>
+              <w:bottom w:type="dxa" w:w="100"/>
+              <w:right w:type="dxa" w:w="120"/>
+            </w:tcMar>
+            <w:vAlign w:val="center"/>
+          </w:tcPr>
+          <w:p>
+            <w:pPr>
+              <w:jc w:val="left"/>
+            </w:pPr>
+            <w:r>
+              <w:rPr>
+                <w:b w:val="false"/>
+                <w:bCs w:val="false"/>
+                <w:i w:val="false"/>
+                <w:iCs w:val="false"/>
+                <w:color w:val="4A6A8A"/>
+                <w:sz w:val="19"/>
+                <w:szCs w:val="19"/>
+              </w:rPr>
+              <w:t xml:space="preserve">Sigla</w:t>
+            </w:r>
+          </w:p>
+        </w:tc>
+        <w:tc>
+          <w:tcPr>
+            <w:tcW w:type="dxa" w:w="5760"/>
+            <w:tcBorders>
+              <w:top w:val="single" w:color="CCCCCC" w:sz="4"/>
+              <w:left w:val="single" w:color="CCCCCC" w:sz="4"/>
+              <w:bottom w:val="single" w:color="CCCCCC" w:sz="4"/>
+              <w:right w:val="single" w:color="CCCCCC" w:sz="4"/>
+            </w:tcBorders>
+            <w:tcMar>
+              <w:top w:type="dxa" w:w="100"/>
+              <w:left w:type="dxa" w:w="120"/>
+              <w:bottom w:type="dxa" w:w="100"/>
+              <w:right w:type="dxa" w:w="120"/>
+            </w:tcMar>
+            <w:vAlign w:val="center"/>
+          </w:tcPr>
+          <w:p>
+            <w:pPr>
+              <w:jc w:val="left"/>
+            </w:pPr>
+            <w:r>
+              <w:rPr>
+                <w:b w:val="false"/>
+                <w:bCs w:val="false"/>
+                <w:i w:val="false"/>
+                <w:iCs w:val="false"/>
+                <w:sz w:val="19"/>
+                <w:szCs w:val="19"/>
+              </w:rPr>
+              <w:t xml:space="preserve">Classificação Internacional de Doenças, 11ª edição (OMS) — referência para Gaming Disorder, usada como fundamentação do indicador Binge Watching.</w:t>
+            </w:r>
+          </w:p>
+        </w:tc>
+      </w:tr>
+      <w:tr>
+        <w:tc>
+          <w:tcPr>
+            <w:tcW w:type="dxa" w:w="2100"/>
+            <w:tcBorders>
+              <w:top w:val="single" w:color="CCCCCC" w:sz="4"/>
+              <w:left w:val="single" w:color="CCCCCC" w:sz="4"/>
+              <w:bottom w:val="single" w:color="CCCCCC" w:sz="4"/>
+              <w:right w:val="single" w:color="CCCCCC" w:sz="4"/>
+            </w:tcBorders>
+            <w:tcMar>
+              <w:top w:type="dxa" w:w="100"/>
+              <w:left w:type="dxa" w:w="120"/>
+              <w:bottom w:type="dxa" w:w="100"/>
+              <w:right w:type="dxa" w:w="120"/>
+            </w:tcMar>
+            <w:vAlign w:val="center"/>
+          </w:tcPr>
+          <w:p>
+            <w:pPr>
+              <w:jc w:val="left"/>
+            </w:pPr>
+            <w:r>
+              <w:rPr>
+                <w:b/>
+                <w:bCs/>
+                <w:i w:val="false"/>
+                <w:iCs w:val="false"/>
+                <w:sz w:val="19"/>
+                <w:szCs w:val="19"/>
+              </w:rPr>
+              <w:t xml:space="preserve">Dependência de IA Generativa</w:t>
+            </w:r>
+          </w:p>
+        </w:tc>
+        <w:tc>
+          <w:tcPr>
+            <w:tcW w:type="dxa" w:w="1500"/>
+            <w:tcBorders>
+              <w:top w:val="single" w:color="CCCCCC" w:sz="4"/>
+              <w:left w:val="single" w:color="CCCCCC" w:sz="4"/>
+              <w:bottom w:val="single" w:color="CCCCCC" w:sz="4"/>
+              <w:right w:val="single" w:color="CCCCCC" w:sz="4"/>
+            </w:tcBorders>
+            <w:tcMar>
+              <w:top w:type="dxa" w:w="100"/>
+              <w:left w:type="dxa" w:w="120"/>
+              <w:bottom w:type="dxa" w:w="100"/>
+              <w:right w:type="dxa" w:w="120"/>
+            </w:tcMar>
+            <w:vAlign w:val="center"/>
+          </w:tcPr>
+          <w:p>
+            <w:pPr>
+              <w:jc w:val="left"/>
+            </w:pPr>
+            <w:r>
+              <w:rPr>
+                <w:b w:val="false"/>
+                <w:bCs w:val="false"/>
+                <w:i w:val="false"/>
+                <w:iCs w:val="false"/>
+                <w:color w:val="4A6A8A"/>
+                <w:sz w:val="19"/>
+                <w:szCs w:val="19"/>
+              </w:rPr>
+              <w:t xml:space="preserve">Indicador</w:t>
+            </w:r>
+          </w:p>
+        </w:tc>
+        <w:tc>
+          <w:tcPr>
+            <w:tcW w:type="dxa" w:w="5760"/>
+            <w:tcBorders>
+              <w:top w:val="single" w:color="CCCCCC" w:sz="4"/>
+              <w:left w:val="single" w:color="CCCCCC" w:sz="4"/>
+              <w:bottom w:val="single" w:color="CCCCCC" w:sz="4"/>
+              <w:right w:val="single" w:color="CCCCCC" w:sz="4"/>
+            </w:tcBorders>
+            <w:tcMar>
+              <w:top w:type="dxa" w:w="100"/>
+              <w:left w:type="dxa" w:w="120"/>
+              <w:bottom w:type="dxa" w:w="100"/>
+              <w:right w:type="dxa" w:w="120"/>
+            </w:tcMar>
+            <w:vAlign w:val="center"/>
+          </w:tcPr>
+          <w:p>
+            <w:pPr>
+              <w:jc w:val="left"/>
+            </w:pPr>
+            <w:r>
+              <w:rPr>
+                <w:b w:val="false"/>
+                <w:bCs w:val="false"/>
+                <w:i w:val="false"/>
+                <w:iCs w:val="false"/>
+                <w:sz w:val="19"/>
+                <w:szCs w:val="19"/>
+              </w:rPr>
+              <w:t xml:space="preserve">Interação compulsiva com assistentes conversacionais; papel de Âncora no backbone do Dígrafo Sindrômico.</w:t>
+            </w:r>
+          </w:p>
+        </w:tc>
+      </w:tr>
+      <w:tr>
+        <w:tc>
+          <w:tcPr>
+            <w:tcW w:type="dxa" w:w="2100"/>
+            <w:tcBorders>
+              <w:top w:val="single" w:color="CCCCCC" w:sz="4"/>
+              <w:left w:val="single" w:color="CCCCCC" w:sz="4"/>
+              <w:bottom w:val="single" w:color="CCCCCC" w:sz="4"/>
+              <w:right w:val="single" w:color="CCCCCC" w:sz="4"/>
+            </w:tcBorders>
+            <w:tcMar>
+              <w:top w:type="dxa" w:w="100"/>
+              <w:left w:type="dxa" w:w="120"/>
+              <w:bottom w:type="dxa" w:w="100"/>
+              <w:right w:type="dxa" w:w="120"/>
+            </w:tcMar>
+            <w:vAlign w:val="center"/>
+          </w:tcPr>
+          <w:p>
+            <w:pPr>
+              <w:jc w:val="left"/>
+            </w:pPr>
+            <w:r>
+              <w:rPr>
+                <w:b/>
+                <w:bCs/>
+                <w:i w:val="false"/>
+                <w:iCs w:val="false"/>
+                <w:sz w:val="19"/>
+                <w:szCs w:val="19"/>
+              </w:rPr>
+              <w:t xml:space="preserve">ECA Digital</w:t>
+            </w:r>
+          </w:p>
+        </w:tc>
+        <w:tc>
+          <w:tcPr>
+            <w:tcW w:type="dxa" w:w="1500"/>
+            <w:tcBorders>
+              <w:top w:val="single" w:color="CCCCCC" w:sz="4"/>
+              <w:left w:val="single" w:color="CCCCCC" w:sz="4"/>
+              <w:bottom w:val="single" w:color="CCCCCC" w:sz="4"/>
+              <w:right w:val="single" w:color="CCCCCC" w:sz="4"/>
+            </w:tcBorders>
+            <w:tcMar>
+              <w:top w:type="dxa" w:w="100"/>
+              <w:left w:type="dxa" w:w="120"/>
+              <w:bottom w:type="dxa" w:w="100"/>
+              <w:right w:type="dxa" w:w="120"/>
+            </w:tcMar>
+            <w:vAlign w:val="center"/>
+          </w:tcPr>
+          <w:p>
+            <w:pPr>
+              <w:jc w:val="left"/>
+            </w:pPr>
+            <w:r>
+              <w:rPr>
+                <w:b w:val="false"/>
+                <w:bCs w:val="false"/>
+                <w:i w:val="false"/>
+                <w:iCs w:val="false"/>
+                <w:color w:val="4A6A8A"/>
+                <w:sz w:val="19"/>
+                <w:szCs w:val="19"/>
+              </w:rPr>
+              <w:t xml:space="preserve">Norma/Framework</w:t>
+            </w:r>
+          </w:p>
+        </w:tc>
+        <w:tc>
+          <w:tcPr>
+            <w:tcW w:type="dxa" w:w="5760"/>
+            <w:tcBorders>
+              <w:top w:val="single" w:color="CCCCCC" w:sz="4"/>
+              <w:left w:val="single" w:color="CCCCCC" w:sz="4"/>
+              <w:bottom w:val="single" w:color="CCCCCC" w:sz="4"/>
+              <w:right w:val="single" w:color="CCCCCC" w:sz="4"/>
+            </w:tcBorders>
+            <w:tcMar>
+              <w:top w:type="dxa" w:w="100"/>
+              <w:left w:type="dxa" w:w="120"/>
+              <w:bottom w:type="dxa" w:w="100"/>
+              <w:right w:type="dxa" w:w="120"/>
+            </w:tcMar>
+            <w:vAlign w:val="center"/>
+          </w:tcPr>
+          <w:p>
+            <w:pPr>
+              <w:jc w:val="left"/>
+            </w:pPr>
+            <w:r>
+              <w:rPr>
+                <w:b w:val="false"/>
+                <w:bCs w:val="false"/>
+                <w:i w:val="false"/>
+                <w:iCs w:val="false"/>
+                <w:sz w:val="19"/>
+                <w:szCs w:val="19"/>
+              </w:rPr>
+              <w:t xml:space="preserve">Lei nº 15.211/2025 (em vigor desde 17/03/2026), Art. 22 e 26 — restringe indicadores comportamentais de rede a saúde preventiva e supervisão parental, vedando uso para publicidade direcionada; base do cohort Parental/Escolar.</w:t>
+            </w:r>
+          </w:p>
+        </w:tc>
+      </w:tr>
+      <w:tr>
+        <w:tc>
+          <w:tcPr>
+            <w:tcW w:type="dxa" w:w="2100"/>
+            <w:tcBorders>
+              <w:top w:val="single" w:color="CCCCCC" w:sz="4"/>
+              <w:left w:val="single" w:color="CCCCCC" w:sz="4"/>
+              <w:bottom w:val="single" w:color="CCCCCC" w:sz="4"/>
+              <w:right w:val="single" w:color="CCCCCC" w:sz="4"/>
+            </w:tcBorders>
+            <w:tcMar>
+              <w:top w:type="dxa" w:w="100"/>
+              <w:left w:type="dxa" w:w="120"/>
+              <w:bottom w:type="dxa" w:w="100"/>
+              <w:right w:type="dxa" w:w="120"/>
+            </w:tcMar>
+            <w:vAlign w:val="center"/>
+          </w:tcPr>
+          <w:p>
+            <w:pPr>
+              <w:jc w:val="left"/>
+            </w:pPr>
+            <w:r>
+              <w:rPr>
+                <w:b/>
+                <w:bCs/>
+                <w:i w:val="false"/>
+                <w:iCs w:val="false"/>
+                <w:sz w:val="19"/>
+                <w:szCs w:val="19"/>
+              </w:rPr>
+              <w:t xml:space="preserve">GRO/PGR</w:t>
+            </w:r>
+          </w:p>
+        </w:tc>
+        <w:tc>
+          <w:tcPr>
+            <w:tcW w:type="dxa" w:w="1500"/>
+            <w:tcBorders>
+              <w:top w:val="single" w:color="CCCCCC" w:sz="4"/>
+              <w:left w:val="single" w:color="CCCCCC" w:sz="4"/>
+              <w:bottom w:val="single" w:color="CCCCCC" w:sz="4"/>
+              <w:right w:val="single" w:color="CCCCCC" w:sz="4"/>
+            </w:tcBorders>
+            <w:tcMar>
+              <w:top w:type="dxa" w:w="100"/>
+              <w:left w:type="dxa" w:w="120"/>
+              <w:bottom w:type="dxa" w:w="100"/>
+              <w:right w:type="dxa" w:w="120"/>
+            </w:tcMar>
+            <w:vAlign w:val="center"/>
+          </w:tcPr>
+          <w:p>
+            <w:pPr>
+              <w:jc w:val="left"/>
+            </w:pPr>
+            <w:r>
+              <w:rPr>
+                <w:b w:val="false"/>
+                <w:bCs w:val="false"/>
+                <w:i w:val="false"/>
+                <w:iCs w:val="false"/>
+                <w:color w:val="4A6A8A"/>
+                <w:sz w:val="19"/>
+                <w:szCs w:val="19"/>
+              </w:rPr>
+              <w:t xml:space="preserve">Sigla</w:t>
+            </w:r>
+          </w:p>
+        </w:tc>
+        <w:tc>
+          <w:tcPr>
+            <w:tcW w:type="dxa" w:w="5760"/>
+            <w:tcBorders>
+              <w:top w:val="single" w:color="CCCCCC" w:sz="4"/>
+              <w:left w:val="single" w:color="CCCCCC" w:sz="4"/>
+              <w:bottom w:val="single" w:color="CCCCCC" w:sz="4"/>
+              <w:right w:val="single" w:color="CCCCCC" w:sz="4"/>
+            </w:tcBorders>
+            <w:tcMar>
+              <w:top w:type="dxa" w:w="100"/>
+              <w:left w:type="dxa" w:w="120"/>
+              <w:bottom w:type="dxa" w:w="100"/>
+              <w:right w:type="dxa" w:w="120"/>
+            </w:tcMar>
+            <w:vAlign w:val="center"/>
+          </w:tcPr>
+          <w:p>
+            <w:pPr>
+              <w:jc w:val="left"/>
+            </w:pPr>
+            <w:r>
+              <w:rPr>
+                <w:b w:val="false"/>
+                <w:bCs w:val="false"/>
+                <w:i w:val="false"/>
+                <w:iCs w:val="false"/>
+                <w:sz w:val="19"/>
+                <w:szCs w:val="19"/>
+              </w:rPr>
+              <w:t xml:space="preserve">Gerenciamento de Riscos Ocupacionais / Programa de Gerenciamento de Riscos, exigido pela NR-1 desde 2022; finalidade restrita do cohort Corporativo.</w:t>
+            </w:r>
+          </w:p>
+        </w:tc>
+      </w:tr>
+      <w:tr>
+        <w:tc>
+          <w:tcPr>
+            <w:tcW w:type="dxa" w:w="2100"/>
+            <w:tcBorders>
+              <w:top w:val="single" w:color="CCCCCC" w:sz="4"/>
+              <w:left w:val="single" w:color="CCCCCC" w:sz="4"/>
+              <w:bottom w:val="single" w:color="CCCCCC" w:sz="4"/>
+              <w:right w:val="single" w:color="CCCCCC" w:sz="4"/>
+            </w:tcBorders>
+            <w:tcMar>
+              <w:top w:type="dxa" w:w="100"/>
+              <w:left w:type="dxa" w:w="120"/>
+              <w:bottom w:type="dxa" w:w="100"/>
+              <w:right w:type="dxa" w:w="120"/>
+            </w:tcMar>
+            <w:vAlign w:val="center"/>
+          </w:tcPr>
+          <w:p>
+            <w:pPr>
+              <w:jc w:val="left"/>
+            </w:pPr>
+            <w:r>
+              <w:rPr>
+                <w:b/>
+                <w:bCs/>
+                <w:i w:val="false"/>
+                <w:iCs w:val="false"/>
+                <w:sz w:val="19"/>
+                <w:szCs w:val="19"/>
+              </w:rPr>
+              <w:t xml:space="preserve">HHI</w:t>
+            </w:r>
+          </w:p>
+        </w:tc>
+        <w:tc>
+          <w:tcPr>
+            <w:tcW w:type="dxa" w:w="1500"/>
+            <w:tcBorders>
+              <w:top w:val="single" w:color="CCCCCC" w:sz="4"/>
+              <w:left w:val="single" w:color="CCCCCC" w:sz="4"/>
+              <w:bottom w:val="single" w:color="CCCCCC" w:sz="4"/>
+              <w:right w:val="single" w:color="CCCCCC" w:sz="4"/>
+            </w:tcBorders>
+            <w:tcMar>
+              <w:top w:type="dxa" w:w="100"/>
+              <w:left w:type="dxa" w:w="120"/>
+              <w:bottom w:type="dxa" w:w="100"/>
+              <w:right w:type="dxa" w:w="120"/>
+            </w:tcMar>
+            <w:vAlign w:val="center"/>
+          </w:tcPr>
+          <w:p>
+            <w:pPr>
+              <w:jc w:val="left"/>
+            </w:pPr>
+            <w:r>
+              <w:rPr>
+                <w:b w:val="false"/>
+                <w:bCs w:val="false"/>
+                <w:i w:val="false"/>
+                <w:iCs w:val="false"/>
+                <w:color w:val="4A6A8A"/>
+                <w:sz w:val="19"/>
+                <w:szCs w:val="19"/>
+              </w:rPr>
+              <w:t xml:space="preserve">Modelo/Técnica</w:t>
+            </w:r>
+          </w:p>
+        </w:tc>
+        <w:tc>
+          <w:tcPr>
+            <w:tcW w:type="dxa" w:w="5760"/>
+            <w:tcBorders>
+              <w:top w:val="single" w:color="CCCCCC" w:sz="4"/>
+              <w:left w:val="single" w:color="CCCCCC" w:sz="4"/>
+              <w:bottom w:val="single" w:color="CCCCCC" w:sz="4"/>
+              <w:right w:val="single" w:color="CCCCCC" w:sz="4"/>
+            </w:tcBorders>
+            <w:tcMar>
+              <w:top w:type="dxa" w:w="100"/>
+              <w:left w:type="dxa" w:w="120"/>
+              <w:bottom w:type="dxa" w:w="100"/>
+              <w:right w:type="dxa" w:w="120"/>
+            </w:tcMar>
+            <w:vAlign w:val="center"/>
+          </w:tcPr>
+          <w:p>
+            <w:pPr>
+              <w:jc w:val="left"/>
+            </w:pPr>
+            <w:r>
+              <w:rPr>
+                <w:b w:val="false"/>
+                <w:bCs w:val="false"/>
+                <w:i w:val="false"/>
+                <w:iCs w:val="false"/>
+                <w:sz w:val="19"/>
+                <w:szCs w:val="19"/>
+              </w:rPr>
+              <w:t xml:space="preserve">Índice Herfindahl-Hirschman — soma dos quadrados dos market-shares; mede concentração de prevalência de cada nó no cohort.</w:t>
+            </w:r>
+          </w:p>
+        </w:tc>
+      </w:tr>
+      <w:tr>
+        <w:tc>
+          <w:tcPr>
+            <w:tcW w:type="dxa" w:w="2100"/>
+            <w:tcBorders>
+              <w:top w:val="single" w:color="CCCCCC" w:sz="4"/>
+              <w:left w:val="single" w:color="CCCCCC" w:sz="4"/>
+              <w:bottom w:val="single" w:color="CCCCCC" w:sz="4"/>
+              <w:right w:val="single" w:color="CCCCCC" w:sz="4"/>
+            </w:tcBorders>
+            <w:tcMar>
+              <w:top w:type="dxa" w:w="100"/>
+              <w:left w:type="dxa" w:w="120"/>
+              <w:bottom w:type="dxa" w:w="100"/>
+              <w:right w:type="dxa" w:w="120"/>
+            </w:tcMar>
+            <w:vAlign w:val="center"/>
+          </w:tcPr>
+          <w:p>
+            <w:pPr>
+              <w:jc w:val="left"/>
+            </w:pPr>
+            <w:r>
+              <w:rPr>
+                <w:b/>
+                <w:bCs/>
+                <w:i w:val="false"/>
+                <w:iCs w:val="false"/>
+                <w:sz w:val="19"/>
+                <w:szCs w:val="19"/>
+              </w:rPr>
+              <w:t xml:space="preserve">IRE (Índice de Retração Espacial)</w:t>
+            </w:r>
+          </w:p>
+        </w:tc>
+        <w:tc>
+          <w:tcPr>
+            <w:tcW w:type="dxa" w:w="1500"/>
+            <w:tcBorders>
+              <w:top w:val="single" w:color="CCCCCC" w:sz="4"/>
+              <w:left w:val="single" w:color="CCCCCC" w:sz="4"/>
+              <w:bottom w:val="single" w:color="CCCCCC" w:sz="4"/>
+              <w:right w:val="single" w:color="CCCCCC" w:sz="4"/>
+            </w:tcBorders>
+            <w:tcMar>
+              <w:top w:type="dxa" w:w="100"/>
+              <w:left w:type="dxa" w:w="120"/>
+              <w:bottom w:type="dxa" w:w="100"/>
+              <w:right w:type="dxa" w:w="120"/>
+            </w:tcMar>
+            <w:vAlign w:val="center"/>
+          </w:tcPr>
+          <w:p>
+            <w:pPr>
+              <w:jc w:val="left"/>
+            </w:pPr>
+            <w:r>
+              <w:rPr>
+                <w:b w:val="false"/>
+                <w:bCs w:val="false"/>
+                <w:i w:val="false"/>
+                <w:iCs w:val="false"/>
+                <w:color w:val="4A6A8A"/>
+                <w:sz w:val="19"/>
+                <w:szCs w:val="19"/>
+              </w:rPr>
+              <w:t xml:space="preserve">Indicador</w:t>
+            </w:r>
+          </w:p>
+        </w:tc>
+        <w:tc>
+          <w:tcPr>
+            <w:tcW w:type="dxa" w:w="5760"/>
+            <w:tcBorders>
+              <w:top w:val="single" w:color="CCCCCC" w:sz="4"/>
+              <w:left w:val="single" w:color="CCCCCC" w:sz="4"/>
+              <w:bottom w:val="single" w:color="CCCCCC" w:sz="4"/>
+              <w:right w:val="single" w:color="CCCCCC" w:sz="4"/>
+            </w:tcBorders>
+            <w:tcMar>
+              <w:top w:type="dxa" w:w="100"/>
+              <w:left w:type="dxa" w:w="120"/>
+              <w:bottom w:type="dxa" w:w="100"/>
+              <w:right w:type="dxa" w:w="120"/>
+            </w:tcMar>
+            <w:vAlign w:val="center"/>
+          </w:tcPr>
+          <w:p>
+            <w:pPr>
+              <w:jc w:val="left"/>
+            </w:pPr>
+            <w:r>
+              <w:rPr>
+                <w:b w:val="false"/>
+                <w:bCs w:val="false"/>
+                <w:i w:val="false"/>
+                <w:iCs w:val="false"/>
+                <w:sz w:val="19"/>
+                <w:szCs w:val="19"/>
+              </w:rPr>
+              <w:t xml:space="preserve">Variação do raio de deslocamento físico; associado ao nó Isolamento, com a maior P(Crise) do backbone (62,5%).</w:t>
+            </w:r>
+          </w:p>
+        </w:tc>
+      </w:tr>
+      <w:tr>
+        <w:tc>
+          <w:tcPr>
+            <w:tcW w:type="dxa" w:w="2100"/>
+            <w:tcBorders>
+              <w:top w:val="single" w:color="CCCCCC" w:sz="4"/>
+              <w:left w:val="single" w:color="CCCCCC" w:sz="4"/>
+              <w:bottom w:val="single" w:color="CCCCCC" w:sz="4"/>
+              <w:right w:val="single" w:color="CCCCCC" w:sz="4"/>
+            </w:tcBorders>
+            <w:tcMar>
+              <w:top w:type="dxa" w:w="100"/>
+              <w:left w:type="dxa" w:w="120"/>
+              <w:bottom w:type="dxa" w:w="100"/>
+              <w:right w:type="dxa" w:w="120"/>
+            </w:tcMar>
+            <w:vAlign w:val="center"/>
+          </w:tcPr>
+          <w:p>
+            <w:pPr>
+              <w:jc w:val="left"/>
+            </w:pPr>
+            <w:r>
+              <w:rPr>
+                <w:b/>
+                <w:bCs/>
+                <w:i w:val="false"/>
+                <w:iCs w:val="false"/>
+                <w:sz w:val="19"/>
+                <w:szCs w:val="19"/>
+              </w:rPr>
+              <w:t xml:space="preserve">JSD</w:t>
+            </w:r>
+          </w:p>
+        </w:tc>
+        <w:tc>
+          <w:tcPr>
+            <w:tcW w:type="dxa" w:w="1500"/>
+            <w:tcBorders>
+              <w:top w:val="single" w:color="CCCCCC" w:sz="4"/>
+              <w:left w:val="single" w:color="CCCCCC" w:sz="4"/>
+              <w:bottom w:val="single" w:color="CCCCCC" w:sz="4"/>
+              <w:right w:val="single" w:color="CCCCCC" w:sz="4"/>
+            </w:tcBorders>
+            <w:tcMar>
+              <w:top w:type="dxa" w:w="100"/>
+              <w:left w:type="dxa" w:w="120"/>
+              <w:bottom w:type="dxa" w:w="100"/>
+              <w:right w:type="dxa" w:w="120"/>
+            </w:tcMar>
+            <w:vAlign w:val="center"/>
+          </w:tcPr>
+          <w:p>
+            <w:pPr>
+              <w:jc w:val="left"/>
+            </w:pPr>
+            <w:r>
+              <w:rPr>
+                <w:b w:val="false"/>
+                <w:bCs w:val="false"/>
+                <w:i w:val="false"/>
+                <w:iCs w:val="false"/>
+                <w:color w:val="4A6A8A"/>
+                <w:sz w:val="19"/>
+                <w:szCs w:val="19"/>
+              </w:rPr>
+              <w:t xml:space="preserve">Modelo/Técnica</w:t>
+            </w:r>
+          </w:p>
+        </w:tc>
+        <w:tc>
+          <w:tcPr>
+            <w:tcW w:type="dxa" w:w="5760"/>
+            <w:tcBorders>
+              <w:top w:val="single" w:color="CCCCCC" w:sz="4"/>
+              <w:left w:val="single" w:color="CCCCCC" w:sz="4"/>
+              <w:bottom w:val="single" w:color="CCCCCC" w:sz="4"/>
+              <w:right w:val="single" w:color="CCCCCC" w:sz="4"/>
+            </w:tcBorders>
+            <w:tcMar>
+              <w:top w:type="dxa" w:w="100"/>
+              <w:left w:type="dxa" w:w="120"/>
+              <w:bottom w:type="dxa" w:w="100"/>
+              <w:right w:type="dxa" w:w="120"/>
+            </w:tcMar>
+            <w:vAlign w:val="center"/>
+          </w:tcPr>
+          <w:p>
+            <w:pPr>
+              <w:jc w:val="left"/>
+            </w:pPr>
+            <w:r>
+              <w:rPr>
+                <w:b w:val="false"/>
+                <w:bCs w:val="false"/>
+                <w:i w:val="false"/>
+                <w:iCs w:val="false"/>
+                <w:sz w:val="19"/>
+                <w:szCs w:val="19"/>
+              </w:rPr>
+              <w:t xml:space="preserve">Divergência de Jensen-Shannon — medida simétrica e limitada (0 a 1) de divergência entre distribuições de probabilidade; mede a variação estrutural (σ) semana a semana.</w:t>
+            </w:r>
+          </w:p>
+        </w:tc>
+      </w:tr>
+      <w:tr>
+        <w:tc>
+          <w:tcPr>
+            <w:tcW w:type="dxa" w:w="2100"/>
+            <w:tcBorders>
+              <w:top w:val="single" w:color="CCCCCC" w:sz="4"/>
+              <w:left w:val="single" w:color="CCCCCC" w:sz="4"/>
+              <w:bottom w:val="single" w:color="CCCCCC" w:sz="4"/>
+              <w:right w:val="single" w:color="CCCCCC" w:sz="4"/>
+            </w:tcBorders>
+            <w:tcMar>
+              <w:top w:type="dxa" w:w="100"/>
+              <w:left w:type="dxa" w:w="120"/>
+              <w:bottom w:type="dxa" w:w="100"/>
+              <w:right w:type="dxa" w:w="120"/>
+            </w:tcMar>
+            <w:vAlign w:val="center"/>
+          </w:tcPr>
+          <w:p>
+            <w:pPr>
+              <w:jc w:val="left"/>
+            </w:pPr>
+            <w:r>
+              <w:rPr>
+                <w:b/>
+                <w:bCs/>
+                <w:i w:val="false"/>
+                <w:iCs w:val="false"/>
+                <w:sz w:val="19"/>
+                <w:szCs w:val="19"/>
+              </w:rPr>
+              <w:t xml:space="preserve">KDD Cognitivo Soberano</w:t>
+            </w:r>
+          </w:p>
+        </w:tc>
+        <w:tc>
+          <w:tcPr>
+            <w:tcW w:type="dxa" w:w="1500"/>
+            <w:tcBorders>
+              <w:top w:val="single" w:color="CCCCCC" w:sz="4"/>
+              <w:left w:val="single" w:color="CCCCCC" w:sz="4"/>
+              <w:bottom w:val="single" w:color="CCCCCC" w:sz="4"/>
+              <w:right w:val="single" w:color="CCCCCC" w:sz="4"/>
+            </w:tcBorders>
+            <w:tcMar>
+              <w:top w:type="dxa" w:w="100"/>
+              <w:left w:type="dxa" w:w="120"/>
+              <w:bottom w:type="dxa" w:w="100"/>
+              <w:right w:type="dxa" w:w="120"/>
+            </w:tcMar>
+            <w:vAlign w:val="center"/>
+          </w:tcPr>
+          <w:p>
+            <w:pPr>
+              <w:jc w:val="left"/>
+            </w:pPr>
+            <w:r>
+              <w:rPr>
+                <w:b w:val="false"/>
+                <w:bCs w:val="false"/>
+                <w:i w:val="false"/>
+                <w:iCs w:val="false"/>
+                <w:color w:val="4A6A8A"/>
+                <w:sz w:val="19"/>
+                <w:szCs w:val="19"/>
+              </w:rPr>
+              <w:t xml:space="preserve">Sigla</w:t>
+            </w:r>
+          </w:p>
+        </w:tc>
+        <w:tc>
+          <w:tcPr>
+            <w:tcW w:type="dxa" w:w="5760"/>
+            <w:tcBorders>
+              <w:top w:val="single" w:color="CCCCCC" w:sz="4"/>
+              <w:left w:val="single" w:color="CCCCCC" w:sz="4"/>
+              <w:bottom w:val="single" w:color="CCCCCC" w:sz="4"/>
+              <w:right w:val="single" w:color="CCCCCC" w:sz="4"/>
+            </w:tcBorders>
+            <w:tcMar>
+              <w:top w:type="dxa" w:w="100"/>
+              <w:left w:type="dxa" w:w="120"/>
+              <w:bottom w:type="dxa" w:w="100"/>
+              <w:right w:type="dxa" w:w="120"/>
+            </w:tcMar>
+            <w:vAlign w:val="center"/>
+          </w:tcPr>
+          <w:p>
+            <w:pPr>
+              <w:jc w:val="left"/>
+            </w:pPr>
+            <w:r>
+              <w:rPr>
+                <w:b w:val="false"/>
+                <w:bCs w:val="false"/>
+                <w:i w:val="false"/>
+                <w:iCs w:val="false"/>
+                <w:sz w:val="19"/>
+                <w:szCs w:val="19"/>
+              </w:rPr>
+              <w:t xml:space="preserve">Knowledge Discovery in Databases — programa institucional da Vísent do qual o Égide Vita é o segundo produto-piloto no domínio Saúde.</w:t>
+            </w:r>
+          </w:p>
+        </w:tc>
+      </w:tr>
+      <w:tr>
+        <w:tc>
+          <w:tcPr>
+            <w:tcW w:type="dxa" w:w="2100"/>
+            <w:tcBorders>
+              <w:top w:val="single" w:color="CCCCCC" w:sz="4"/>
+              <w:left w:val="single" w:color="CCCCCC" w:sz="4"/>
+              <w:bottom w:val="single" w:color="CCCCCC" w:sz="4"/>
+              <w:right w:val="single" w:color="CCCCCC" w:sz="4"/>
+            </w:tcBorders>
+            <w:tcMar>
+              <w:top w:type="dxa" w:w="100"/>
+              <w:left w:type="dxa" w:w="120"/>
+              <w:bottom w:type="dxa" w:w="100"/>
+              <w:right w:type="dxa" w:w="120"/>
+            </w:tcMar>
+            <w:vAlign w:val="center"/>
+          </w:tcPr>
+          <w:p>
+            <w:pPr>
+              <w:jc w:val="left"/>
+            </w:pPr>
+            <w:r>
+              <w:rPr>
+                <w:b/>
+                <w:bCs/>
+                <w:i w:val="false"/>
+                <w:iCs w:val="false"/>
+                <w:sz w:val="19"/>
+                <w:szCs w:val="19"/>
+              </w:rPr>
+              <w:t xml:space="preserve">LGPD</w:t>
+            </w:r>
+          </w:p>
+        </w:tc>
+        <w:tc>
+          <w:tcPr>
+            <w:tcW w:type="dxa" w:w="1500"/>
+            <w:tcBorders>
+              <w:top w:val="single" w:color="CCCCCC" w:sz="4"/>
+              <w:left w:val="single" w:color="CCCCCC" w:sz="4"/>
+              <w:bottom w:val="single" w:color="CCCCCC" w:sz="4"/>
+              <w:right w:val="single" w:color="CCCCCC" w:sz="4"/>
+            </w:tcBorders>
+            <w:tcMar>
+              <w:top w:type="dxa" w:w="100"/>
+              <w:left w:type="dxa" w:w="120"/>
+              <w:bottom w:type="dxa" w:w="100"/>
+              <w:right w:type="dxa" w:w="120"/>
+            </w:tcMar>
+            <w:vAlign w:val="center"/>
+          </w:tcPr>
+          <w:p>
+            <w:pPr>
+              <w:jc w:val="left"/>
+            </w:pPr>
+            <w:r>
+              <w:rPr>
+                <w:b w:val="false"/>
+                <w:bCs w:val="false"/>
+                <w:i w:val="false"/>
+                <w:iCs w:val="false"/>
+                <w:color w:val="4A6A8A"/>
+                <w:sz w:val="19"/>
+                <w:szCs w:val="19"/>
+              </w:rPr>
+              <w:t xml:space="preserve">Sigla</w:t>
+            </w:r>
+          </w:p>
+        </w:tc>
+        <w:tc>
+          <w:tcPr>
+            <w:tcW w:type="dxa" w:w="5760"/>
+            <w:tcBorders>
+              <w:top w:val="single" w:color="CCCCCC" w:sz="4"/>
+              <w:left w:val="single" w:color="CCCCCC" w:sz="4"/>
+              <w:bottom w:val="single" w:color="CCCCCC" w:sz="4"/>
+              <w:right w:val="single" w:color="CCCCCC" w:sz="4"/>
+            </w:tcBorders>
+            <w:tcMar>
+              <w:top w:type="dxa" w:w="100"/>
+              <w:left w:type="dxa" w:w="120"/>
+              <w:bottom w:type="dxa" w:w="100"/>
+              <w:right w:type="dxa" w:w="120"/>
+            </w:tcMar>
+            <w:vAlign w:val="center"/>
+          </w:tcPr>
+          <w:p>
+            <w:pPr>
+              <w:jc w:val="left"/>
+            </w:pPr>
+            <w:r>
+              <w:rPr>
+                <w:b w:val="false"/>
+                <w:bCs w:val="false"/>
+                <w:i w:val="false"/>
+                <w:iCs w:val="false"/>
+                <w:sz w:val="19"/>
+                <w:szCs w:val="19"/>
+              </w:rPr>
+              <w:t xml:space="preserve">Lei Geral de Proteção de Dados (Lei nº 13.709/2018, art. 7º e 14); base legal de consentimento por cohort (agregado, coletivo ou do responsável legal).</w:t>
+            </w:r>
+          </w:p>
+        </w:tc>
+      </w:tr>
+      <w:tr>
+        <w:tc>
+          <w:tcPr>
+            <w:tcW w:type="dxa" w:w="2100"/>
+            <w:tcBorders>
+              <w:top w:val="single" w:color="CCCCCC" w:sz="4"/>
+              <w:left w:val="single" w:color="CCCCCC" w:sz="4"/>
+              <w:bottom w:val="single" w:color="CCCCCC" w:sz="4"/>
+              <w:right w:val="single" w:color="CCCCCC" w:sz="4"/>
+            </w:tcBorders>
+            <w:tcMar>
+              <w:top w:type="dxa" w:w="100"/>
+              <w:left w:type="dxa" w:w="120"/>
+              <w:bottom w:type="dxa" w:w="100"/>
+              <w:right w:type="dxa" w:w="120"/>
+            </w:tcMar>
+            <w:vAlign w:val="center"/>
+          </w:tcPr>
+          <w:p>
+            <w:pPr>
+              <w:jc w:val="left"/>
+            </w:pPr>
+            <w:r>
+              <w:rPr>
+                <w:b/>
+                <w:bCs/>
+                <w:i w:val="false"/>
+                <w:iCs w:val="false"/>
+                <w:sz w:val="19"/>
+                <w:szCs w:val="19"/>
+              </w:rPr>
+              <w:t xml:space="preserve">Marco Legal da IA (PL 2338/2023)</w:t>
+            </w:r>
+          </w:p>
+        </w:tc>
+        <w:tc>
+          <w:tcPr>
+            <w:tcW w:type="dxa" w:w="1500"/>
+            <w:tcBorders>
+              <w:top w:val="single" w:color="CCCCCC" w:sz="4"/>
+              <w:left w:val="single" w:color="CCCCCC" w:sz="4"/>
+              <w:bottom w:val="single" w:color="CCCCCC" w:sz="4"/>
+              <w:right w:val="single" w:color="CCCCCC" w:sz="4"/>
+            </w:tcBorders>
+            <w:tcMar>
+              <w:top w:type="dxa" w:w="100"/>
+              <w:left w:type="dxa" w:w="120"/>
+              <w:bottom w:type="dxa" w:w="100"/>
+              <w:right w:type="dxa" w:w="120"/>
+            </w:tcMar>
+            <w:vAlign w:val="center"/>
+          </w:tcPr>
+          <w:p>
+            <w:pPr>
+              <w:jc w:val="left"/>
+            </w:pPr>
+            <w:r>
+              <w:rPr>
+                <w:b w:val="false"/>
+                <w:bCs w:val="false"/>
+                <w:i w:val="false"/>
+                <w:iCs w:val="false"/>
+                <w:color w:val="4A6A8A"/>
+                <w:sz w:val="19"/>
+                <w:szCs w:val="19"/>
+              </w:rPr>
+              <w:t xml:space="preserve">Norma/Framework</w:t>
+            </w:r>
+          </w:p>
+        </w:tc>
+        <w:tc>
+          <w:tcPr>
+            <w:tcW w:type="dxa" w:w="5760"/>
+            <w:tcBorders>
+              <w:top w:val="single" w:color="CCCCCC" w:sz="4"/>
+              <w:left w:val="single" w:color="CCCCCC" w:sz="4"/>
+              <w:bottom w:val="single" w:color="CCCCCC" w:sz="4"/>
+              <w:right w:val="single" w:color="CCCCCC" w:sz="4"/>
+            </w:tcBorders>
+            <w:tcMar>
+              <w:top w:type="dxa" w:w="100"/>
+              <w:left w:type="dxa" w:w="120"/>
+              <w:bottom w:type="dxa" w:w="100"/>
+              <w:right w:type="dxa" w:w="120"/>
+            </w:tcMar>
+            <w:vAlign w:val="center"/>
+          </w:tcPr>
+          <w:p>
+            <w:pPr>
+              <w:jc w:val="left"/>
+            </w:pPr>
+            <w:r>
+              <w:rPr>
+                <w:b w:val="false"/>
+                <w:bCs w:val="false"/>
+                <w:i w:val="false"/>
+                <w:iCs w:val="false"/>
+                <w:sz w:val="19"/>
+                <w:szCs w:val="19"/>
+              </w:rPr>
+              <w:t xml:space="preserve">Aprovado no Senado em dez/2024, em tramitação na Câmara; classifica sistemas de IA em saúde como de alto risco, exigindo explicabilidade e supervisão humana.</w:t>
+            </w:r>
+          </w:p>
+        </w:tc>
+      </w:tr>
+      <w:tr>
+        <w:tc>
+          <w:tcPr>
+            <w:tcW w:type="dxa" w:w="2100"/>
+            <w:tcBorders>
+              <w:top w:val="single" w:color="CCCCCC" w:sz="4"/>
+              <w:left w:val="single" w:color="CCCCCC" w:sz="4"/>
+              <w:bottom w:val="single" w:color="CCCCCC" w:sz="4"/>
+              <w:right w:val="single" w:color="CCCCCC" w:sz="4"/>
+            </w:tcBorders>
+            <w:tcMar>
+              <w:top w:type="dxa" w:w="100"/>
+              <w:left w:type="dxa" w:w="120"/>
+              <w:bottom w:type="dxa" w:w="100"/>
+              <w:right w:type="dxa" w:w="120"/>
+            </w:tcMar>
+            <w:vAlign w:val="center"/>
+          </w:tcPr>
+          <w:p>
+            <w:pPr>
+              <w:jc w:val="left"/>
+            </w:pPr>
+            <w:r>
+              <w:rPr>
+                <w:b/>
+                <w:bCs/>
+                <w:i w:val="false"/>
+                <w:iCs w:val="false"/>
+                <w:sz w:val="19"/>
+                <w:szCs w:val="19"/>
+              </w:rPr>
+              <w:t xml:space="preserve">Markov Absorvente (Cadeia de Markov Absorvente)</w:t>
+            </w:r>
+          </w:p>
+        </w:tc>
+        <w:tc>
+          <w:tcPr>
+            <w:tcW w:type="dxa" w:w="1500"/>
+            <w:tcBorders>
+              <w:top w:val="single" w:color="CCCCCC" w:sz="4"/>
+              <w:left w:val="single" w:color="CCCCCC" w:sz="4"/>
+              <w:bottom w:val="single" w:color="CCCCCC" w:sz="4"/>
+              <w:right w:val="single" w:color="CCCCCC" w:sz="4"/>
+            </w:tcBorders>
+            <w:tcMar>
+              <w:top w:type="dxa" w:w="100"/>
+              <w:left w:type="dxa" w:w="120"/>
+              <w:bottom w:type="dxa" w:w="100"/>
+              <w:right w:type="dxa" w:w="120"/>
+            </w:tcMar>
+            <w:vAlign w:val="center"/>
+          </w:tcPr>
+          <w:p>
+            <w:pPr>
+              <w:jc w:val="left"/>
+            </w:pPr>
+            <w:r>
+              <w:rPr>
+                <w:b w:val="false"/>
+                <w:bCs w:val="false"/>
+                <w:i w:val="false"/>
+                <w:iCs w:val="false"/>
+                <w:color w:val="4A6A8A"/>
+                <w:sz w:val="19"/>
+                <w:szCs w:val="19"/>
+              </w:rPr>
+              <w:t xml:space="preserve">Modelo/Técnica</w:t>
+            </w:r>
+          </w:p>
+        </w:tc>
+        <w:tc>
+          <w:tcPr>
+            <w:tcW w:type="dxa" w:w="5760"/>
+            <w:tcBorders>
+              <w:top w:val="single" w:color="CCCCCC" w:sz="4"/>
+              <w:left w:val="single" w:color="CCCCCC" w:sz="4"/>
+              <w:bottom w:val="single" w:color="CCCCCC" w:sz="4"/>
+              <w:right w:val="single" w:color="CCCCCC" w:sz="4"/>
+            </w:tcBorders>
+            <w:tcMar>
+              <w:top w:type="dxa" w:w="100"/>
+              <w:left w:type="dxa" w:w="120"/>
+              <w:bottom w:type="dxa" w:w="100"/>
+              <w:right w:type="dxa" w:w="120"/>
+            </w:tcMar>
+            <w:vAlign w:val="center"/>
+          </w:tcPr>
+          <w:p>
+            <w:pPr>
+              <w:jc w:val="left"/>
+            </w:pPr>
+            <w:r>
+              <w:rPr>
+                <w:b w:val="false"/>
+                <w:bCs w:val="false"/>
+                <w:i w:val="false"/>
+                <w:iCs w:val="false"/>
+                <w:sz w:val="19"/>
+                <w:szCs w:val="19"/>
+              </w:rPr>
+              <w:t xml:space="preserve">Matriz fundamental N=(I−Q)⁻¹ e B=N·R sobre dois estados absorventes competitivos (Crise/Estabilização); calcula a probabilidade estrutural de desfecho de cada nó.</w:t>
+            </w:r>
+          </w:p>
+        </w:tc>
+      </w:tr>
+      <w:tr>
+        <w:tc>
+          <w:tcPr>
+            <w:tcW w:type="dxa" w:w="2100"/>
+            <w:tcBorders>
+              <w:top w:val="single" w:color="CCCCCC" w:sz="4"/>
+              <w:left w:val="single" w:color="CCCCCC" w:sz="4"/>
+              <w:bottom w:val="single" w:color="CCCCCC" w:sz="4"/>
+              <w:right w:val="single" w:color="CCCCCC" w:sz="4"/>
+            </w:tcBorders>
+            <w:tcMar>
+              <w:top w:type="dxa" w:w="100"/>
+              <w:left w:type="dxa" w:w="120"/>
+              <w:bottom w:type="dxa" w:w="100"/>
+              <w:right w:type="dxa" w:w="120"/>
+            </w:tcMar>
+            <w:vAlign w:val="center"/>
+          </w:tcPr>
+          <w:p>
+            <w:pPr>
+              <w:jc w:val="left"/>
+            </w:pPr>
+            <w:r>
+              <w:rPr>
+                <w:b/>
+                <w:bCs/>
+                <w:i w:val="false"/>
+                <w:iCs w:val="false"/>
+                <w:sz w:val="19"/>
+                <w:szCs w:val="19"/>
+              </w:rPr>
+              <w:t xml:space="preserve">NR-1</w:t>
+            </w:r>
+          </w:p>
+        </w:tc>
+        <w:tc>
+          <w:tcPr>
+            <w:tcW w:type="dxa" w:w="1500"/>
+            <w:tcBorders>
+              <w:top w:val="single" w:color="CCCCCC" w:sz="4"/>
+              <w:left w:val="single" w:color="CCCCCC" w:sz="4"/>
+              <w:bottom w:val="single" w:color="CCCCCC" w:sz="4"/>
+              <w:right w:val="single" w:color="CCCCCC" w:sz="4"/>
+            </w:tcBorders>
+            <w:tcMar>
+              <w:top w:type="dxa" w:w="100"/>
+              <w:left w:type="dxa" w:w="120"/>
+              <w:bottom w:type="dxa" w:w="100"/>
+              <w:right w:type="dxa" w:w="120"/>
+            </w:tcMar>
+            <w:vAlign w:val="center"/>
+          </w:tcPr>
+          <w:p>
+            <w:pPr>
+              <w:jc w:val="left"/>
+            </w:pPr>
+            <w:r>
+              <w:rPr>
+                <w:b w:val="false"/>
+                <w:bCs w:val="false"/>
+                <w:i w:val="false"/>
+                <w:iCs w:val="false"/>
+                <w:color w:val="4A6A8A"/>
+                <w:sz w:val="19"/>
+                <w:szCs w:val="19"/>
+              </w:rPr>
+              <w:t xml:space="preserve">Sigla</w:t>
+            </w:r>
+          </w:p>
+        </w:tc>
+        <w:tc>
+          <w:tcPr>
+            <w:tcW w:type="dxa" w:w="5760"/>
+            <w:tcBorders>
+              <w:top w:val="single" w:color="CCCCCC" w:sz="4"/>
+              <w:left w:val="single" w:color="CCCCCC" w:sz="4"/>
+              <w:bottom w:val="single" w:color="CCCCCC" w:sz="4"/>
+              <w:right w:val="single" w:color="CCCCCC" w:sz="4"/>
+            </w:tcBorders>
+            <w:tcMar>
+              <w:top w:type="dxa" w:w="100"/>
+              <w:left w:type="dxa" w:w="120"/>
+              <w:bottom w:type="dxa" w:w="100"/>
+              <w:right w:type="dxa" w:w="120"/>
+            </w:tcMar>
+            <w:vAlign w:val="center"/>
+          </w:tcPr>
+          <w:p>
+            <w:pPr>
+              <w:jc w:val="left"/>
+            </w:pPr>
+            <w:r>
+              <w:rPr>
+                <w:b w:val="false"/>
+                <w:bCs w:val="false"/>
+                <w:i w:val="false"/>
+                <w:iCs w:val="false"/>
+                <w:sz w:val="19"/>
+                <w:szCs w:val="19"/>
+              </w:rPr>
+              <w:t xml:space="preserve">Norma Regulamentadora 1 (MTE, atualizada 2022) — gestão de riscos ocupacionais, incluindo fatores psicossociais; base do módulo Corporativo/GRO-PGR.</w:t>
+            </w:r>
+          </w:p>
+        </w:tc>
+      </w:tr>
+      <w:tr>
+        <w:tc>
+          <w:tcPr>
+            <w:tcW w:type="dxa" w:w="2100"/>
+            <w:tcBorders>
+              <w:top w:val="single" w:color="CCCCCC" w:sz="4"/>
+              <w:left w:val="single" w:color="CCCCCC" w:sz="4"/>
+              <w:bottom w:val="single" w:color="CCCCCC" w:sz="4"/>
+              <w:right w:val="single" w:color="CCCCCC" w:sz="4"/>
+            </w:tcBorders>
+            <w:tcMar>
+              <w:top w:type="dxa" w:w="100"/>
+              <w:left w:type="dxa" w:w="120"/>
+              <w:bottom w:type="dxa" w:w="100"/>
+              <w:right w:type="dxa" w:w="120"/>
+            </w:tcMar>
+            <w:vAlign w:val="center"/>
+          </w:tcPr>
+          <w:p>
+            <w:pPr>
+              <w:jc w:val="left"/>
+            </w:pPr>
+            <w:r>
+              <w:rPr>
+                <w:b/>
+                <w:bCs/>
+                <w:i w:val="false"/>
+                <w:iCs w:val="false"/>
+                <w:sz w:val="19"/>
+                <w:szCs w:val="19"/>
+              </w:rPr>
+              <w:t xml:space="preserve">PBIA</w:t>
+            </w:r>
+          </w:p>
+        </w:tc>
+        <w:tc>
+          <w:tcPr>
+            <w:tcW w:type="dxa" w:w="1500"/>
+            <w:tcBorders>
+              <w:top w:val="single" w:color="CCCCCC" w:sz="4"/>
+              <w:left w:val="single" w:color="CCCCCC" w:sz="4"/>
+              <w:bottom w:val="single" w:color="CCCCCC" w:sz="4"/>
+              <w:right w:val="single" w:color="CCCCCC" w:sz="4"/>
+            </w:tcBorders>
+            <w:tcMar>
+              <w:top w:type="dxa" w:w="100"/>
+              <w:left w:type="dxa" w:w="120"/>
+              <w:bottom w:type="dxa" w:w="100"/>
+              <w:right w:type="dxa" w:w="120"/>
+            </w:tcMar>
+            <w:vAlign w:val="center"/>
+          </w:tcPr>
+          <w:p>
+            <w:pPr>
+              <w:jc w:val="left"/>
+            </w:pPr>
+            <w:r>
+              <w:rPr>
+                <w:b w:val="false"/>
+                <w:bCs w:val="false"/>
+                <w:i w:val="false"/>
+                <w:iCs w:val="false"/>
+                <w:color w:val="4A6A8A"/>
+                <w:sz w:val="19"/>
+                <w:szCs w:val="19"/>
+              </w:rPr>
+              <w:t xml:space="preserve">Sigla</w:t>
+            </w:r>
+          </w:p>
+        </w:tc>
+        <w:tc>
+          <w:tcPr>
+            <w:tcW w:type="dxa" w:w="5760"/>
+            <w:tcBorders>
+              <w:top w:val="single" w:color="CCCCCC" w:sz="4"/>
+              <w:left w:val="single" w:color="CCCCCC" w:sz="4"/>
+              <w:bottom w:val="single" w:color="CCCCCC" w:sz="4"/>
+              <w:right w:val="single" w:color="CCCCCC" w:sz="4"/>
+            </w:tcBorders>
+            <w:tcMar>
+              <w:top w:type="dxa" w:w="100"/>
+              <w:left w:type="dxa" w:w="120"/>
+              <w:bottom w:type="dxa" w:w="100"/>
+              <w:right w:type="dxa" w:w="120"/>
+            </w:tcMar>
+            <w:vAlign w:val="center"/>
+          </w:tcPr>
+          <w:p>
+            <w:pPr>
+              <w:jc w:val="left"/>
+            </w:pPr>
+            <w:r>
+              <w:rPr>
+                <w:b w:val="false"/>
+                <w:bCs w:val="false"/>
+                <w:i w:val="false"/>
+                <w:iCs w:val="false"/>
+                <w:sz w:val="19"/>
+                <w:szCs w:val="19"/>
+              </w:rPr>
+              <w:t xml:space="preserve">Plano Brasileiro de Inteligência Artificial 2024–2028 — R$ 23,03 bilhões em cinco pilares, incluindo soberania tecnológica e aplicações prioritárias em saúde.</w:t>
+            </w:r>
+          </w:p>
+        </w:tc>
+      </w:tr>
+      <w:tr>
+        <w:tc>
+          <w:tcPr>
+            <w:tcW w:type="dxa" w:w="2100"/>
+            <w:tcBorders>
+              <w:top w:val="single" w:color="CCCCCC" w:sz="4"/>
+              <w:left w:val="single" w:color="CCCCCC" w:sz="4"/>
+              <w:bottom w:val="single" w:color="CCCCCC" w:sz="4"/>
+              <w:right w:val="single" w:color="CCCCCC" w:sz="4"/>
+            </w:tcBorders>
+            <w:tcMar>
+              <w:top w:type="dxa" w:w="100"/>
+              <w:left w:type="dxa" w:w="120"/>
+              <w:bottom w:type="dxa" w:w="100"/>
+              <w:right w:type="dxa" w:w="120"/>
+            </w:tcMar>
+            <w:vAlign w:val="center"/>
+          </w:tcPr>
+          <w:p>
+            <w:pPr>
+              <w:jc w:val="left"/>
+            </w:pPr>
+            <w:r>
+              <w:rPr>
+                <w:b/>
+                <w:bCs/>
+                <w:i w:val="false"/>
+                <w:iCs w:val="false"/>
+                <w:sz w:val="19"/>
+                <w:szCs w:val="19"/>
+              </w:rPr>
+              <w:t xml:space="preserve">RAG</w:t>
+            </w:r>
+          </w:p>
+        </w:tc>
+        <w:tc>
+          <w:tcPr>
+            <w:tcW w:type="dxa" w:w="1500"/>
+            <w:tcBorders>
+              <w:top w:val="single" w:color="CCCCCC" w:sz="4"/>
+              <w:left w:val="single" w:color="CCCCCC" w:sz="4"/>
+              <w:bottom w:val="single" w:color="CCCCCC" w:sz="4"/>
+              <w:right w:val="single" w:color="CCCCCC" w:sz="4"/>
+            </w:tcBorders>
+            <w:tcMar>
+              <w:top w:type="dxa" w:w="100"/>
+              <w:left w:type="dxa" w:w="120"/>
+              <w:bottom w:type="dxa" w:w="100"/>
+              <w:right w:type="dxa" w:w="120"/>
+            </w:tcMar>
+            <w:vAlign w:val="center"/>
+          </w:tcPr>
+          <w:p>
+            <w:pPr>
+              <w:jc w:val="left"/>
+            </w:pPr>
+            <w:r>
+              <w:rPr>
+                <w:b w:val="false"/>
+                <w:bCs w:val="false"/>
+                <w:i w:val="false"/>
+                <w:iCs w:val="false"/>
+                <w:color w:val="4A6A8A"/>
+                <w:sz w:val="19"/>
+                <w:szCs w:val="19"/>
+              </w:rPr>
+              <w:t xml:space="preserve">Sigla</w:t>
+            </w:r>
+          </w:p>
+        </w:tc>
+        <w:tc>
+          <w:tcPr>
+            <w:tcW w:type="dxa" w:w="5760"/>
+            <w:tcBorders>
+              <w:top w:val="single" w:color="CCCCCC" w:sz="4"/>
+              <w:left w:val="single" w:color="CCCCCC" w:sz="4"/>
+              <w:bottom w:val="single" w:color="CCCCCC" w:sz="4"/>
+              <w:right w:val="single" w:color="CCCCCC" w:sz="4"/>
+            </w:tcBorders>
+            <w:tcMar>
+              <w:top w:type="dxa" w:w="100"/>
+              <w:left w:type="dxa" w:w="120"/>
+              <w:bottom w:type="dxa" w:w="100"/>
+              <w:right w:type="dxa" w:w="120"/>
+            </w:tcMar>
+            <w:vAlign w:val="center"/>
+          </w:tcPr>
+          <w:p>
+            <w:pPr>
+              <w:jc w:val="left"/>
+            </w:pPr>
+            <w:r>
+              <w:rPr>
+                <w:b w:val="false"/>
+                <w:bCs w:val="false"/>
+                <w:i w:val="false"/>
+                <w:iCs w:val="false"/>
+                <w:sz w:val="19"/>
+                <w:szCs w:val="19"/>
+              </w:rPr>
+              <w:t xml:space="preserve">Retrieval-Augmented Generation — nome do padrão do Assistente do produto; implementação real é busca por contagem de palavras-chave, sem inferência de LLM.</w:t>
+            </w:r>
+          </w:p>
+        </w:tc>
+      </w:tr>
+      <w:tr>
+        <w:tc>
+          <w:tcPr>
+            <w:tcW w:type="dxa" w:w="2100"/>
+            <w:tcBorders>
+              <w:top w:val="single" w:color="CCCCCC" w:sz="4"/>
+              <w:left w:val="single" w:color="CCCCCC" w:sz="4"/>
+              <w:bottom w:val="single" w:color="CCCCCC" w:sz="4"/>
+              <w:right w:val="single" w:color="CCCCCC" w:sz="4"/>
+            </w:tcBorders>
+            <w:tcMar>
+              <w:top w:type="dxa" w:w="100"/>
+              <w:left w:type="dxa" w:w="120"/>
+              <w:bottom w:type="dxa" w:w="100"/>
+              <w:right w:type="dxa" w:w="120"/>
+            </w:tcMar>
+            <w:vAlign w:val="center"/>
+          </w:tcPr>
+          <w:p>
+            <w:pPr>
+              <w:jc w:val="left"/>
+            </w:pPr>
+            <w:r>
+              <w:rPr>
+                <w:b/>
+                <w:bCs/>
+                <w:i w:val="false"/>
+                <w:iCs w:val="false"/>
+                <w:sz w:val="19"/>
+                <w:szCs w:val="19"/>
+              </w:rPr>
+              <w:t xml:space="preserve">Teoria de Rede da Psicopatologia</w:t>
+            </w:r>
+          </w:p>
+        </w:tc>
+        <w:tc>
+          <w:tcPr>
+            <w:tcW w:type="dxa" w:w="1500"/>
+            <w:tcBorders>
+              <w:top w:val="single" w:color="CCCCCC" w:sz="4"/>
+              <w:left w:val="single" w:color="CCCCCC" w:sz="4"/>
+              <w:bottom w:val="single" w:color="CCCCCC" w:sz="4"/>
+              <w:right w:val="single" w:color="CCCCCC" w:sz="4"/>
+            </w:tcBorders>
+            <w:tcMar>
+              <w:top w:type="dxa" w:w="100"/>
+              <w:left w:type="dxa" w:w="120"/>
+              <w:bottom w:type="dxa" w:w="100"/>
+              <w:right w:type="dxa" w:w="120"/>
+            </w:tcMar>
+            <w:vAlign w:val="center"/>
+          </w:tcPr>
+          <w:p>
+            <w:pPr>
+              <w:jc w:val="left"/>
+            </w:pPr>
+            <w:r>
+              <w:rPr>
+                <w:b w:val="false"/>
+                <w:bCs w:val="false"/>
+                <w:i w:val="false"/>
+                <w:iCs w:val="false"/>
+                <w:color w:val="4A6A8A"/>
+                <w:sz w:val="19"/>
+                <w:szCs w:val="19"/>
+              </w:rPr>
+              <w:t xml:space="preserve">Modelo/Técnica</w:t>
+            </w:r>
+          </w:p>
+        </w:tc>
+        <w:tc>
+          <w:tcPr>
+            <w:tcW w:type="dxa" w:w="5760"/>
+            <w:tcBorders>
+              <w:top w:val="single" w:color="CCCCCC" w:sz="4"/>
+              <w:left w:val="single" w:color="CCCCCC" w:sz="4"/>
+              <w:bottom w:val="single" w:color="CCCCCC" w:sz="4"/>
+              <w:right w:val="single" w:color="CCCCCC" w:sz="4"/>
+            </w:tcBorders>
+            <w:tcMar>
+              <w:top w:type="dxa" w:w="100"/>
+              <w:left w:type="dxa" w:w="120"/>
+              <w:bottom w:type="dxa" w:w="100"/>
+              <w:right w:type="dxa" w:w="120"/>
+            </w:tcMar>
+            <w:vAlign w:val="center"/>
+          </w:tcPr>
+          <w:p>
+            <w:pPr>
+              <w:jc w:val="left"/>
+            </w:pPr>
+            <w:r>
+              <w:rPr>
+                <w:b w:val="false"/>
+                <w:bCs w:val="false"/>
+                <w:i w:val="false"/>
+                <w:iCs w:val="false"/>
+                <w:sz w:val="19"/>
+                <w:szCs w:val="19"/>
+              </w:rPr>
+              <w:t xml:space="preserve">Transtornos mentais modelados como redes de sintomas sustentadas por loops de feedback, não como categoria única com causa central (Borsboom, 2017); fundamenta a leitura de ciclos de reforço no Dígrafo Sindrômico.</w:t>
+            </w:r>
+          </w:p>
+        </w:tc>
+      </w:tr>
+      <w:tr>
+        <w:tc>
+          <w:tcPr>
+            <w:tcW w:type="dxa" w:w="2100"/>
+            <w:tcBorders>
+              <w:top w:val="single" w:color="CCCCCC" w:sz="4"/>
+              <w:left w:val="single" w:color="CCCCCC" w:sz="4"/>
+              <w:bottom w:val="single" w:color="CCCCCC" w:sz="4"/>
+              <w:right w:val="single" w:color="CCCCCC" w:sz="4"/>
+            </w:tcBorders>
+            <w:tcMar>
+              <w:top w:type="dxa" w:w="100"/>
+              <w:left w:type="dxa" w:w="120"/>
+              <w:bottom w:type="dxa" w:w="100"/>
+              <w:right w:type="dxa" w:w="120"/>
+            </w:tcMar>
+            <w:vAlign w:val="center"/>
+          </w:tcPr>
+          <w:p>
+            <w:pPr>
+              <w:jc w:val="left"/>
+            </w:pPr>
+            <w:r>
+              <w:rPr>
+                <w:b/>
+                <w:bCs/>
+                <w:i w:val="false"/>
+                <w:iCs w:val="false"/>
+                <w:sz w:val="19"/>
+                <w:szCs w:val="19"/>
+              </w:rPr>
+              <w:t xml:space="preserve">Vamping</w:t>
+            </w:r>
+          </w:p>
+        </w:tc>
+        <w:tc>
+          <w:tcPr>
+            <w:tcW w:type="dxa" w:w="1500"/>
+            <w:tcBorders>
+              <w:top w:val="single" w:color="CCCCCC" w:sz="4"/>
+              <w:left w:val="single" w:color="CCCCCC" w:sz="4"/>
+              <w:bottom w:val="single" w:color="CCCCCC" w:sz="4"/>
+              <w:right w:val="single" w:color="CCCCCC" w:sz="4"/>
+            </w:tcBorders>
+            <w:tcMar>
+              <w:top w:type="dxa" w:w="100"/>
+              <w:left w:type="dxa" w:w="120"/>
+              <w:bottom w:type="dxa" w:w="100"/>
+              <w:right w:type="dxa" w:w="120"/>
+            </w:tcMar>
+            <w:vAlign w:val="center"/>
+          </w:tcPr>
+          <w:p>
+            <w:pPr>
+              <w:jc w:val="left"/>
+            </w:pPr>
+            <w:r>
+              <w:rPr>
+                <w:b w:val="false"/>
+                <w:bCs w:val="false"/>
+                <w:i w:val="false"/>
+                <w:iCs w:val="false"/>
+                <w:color w:val="4A6A8A"/>
+                <w:sz w:val="19"/>
+                <w:szCs w:val="19"/>
+              </w:rPr>
+              <w:t xml:space="preserve">Indicador</w:t>
+            </w:r>
+          </w:p>
+        </w:tc>
+        <w:tc>
+          <w:tcPr>
+            <w:tcW w:type="dxa" w:w="5760"/>
+            <w:tcBorders>
+              <w:top w:val="single" w:color="CCCCCC" w:sz="4"/>
+              <w:left w:val="single" w:color="CCCCCC" w:sz="4"/>
+              <w:bottom w:val="single" w:color="CCCCCC" w:sz="4"/>
+              <w:right w:val="single" w:color="CCCCCC" w:sz="4"/>
+            </w:tcBorders>
+            <w:tcMar>
+              <w:top w:type="dxa" w:w="100"/>
+              <w:left w:type="dxa" w:w="120"/>
+              <w:bottom w:type="dxa" w:w="100"/>
+              <w:right w:type="dxa" w:w="120"/>
+            </w:tcMar>
+            <w:vAlign w:val="center"/>
+          </w:tcPr>
+          <w:p>
+            <w:pPr>
+              <w:jc w:val="left"/>
+            </w:pPr>
+            <w:r>
+              <w:rPr>
+                <w:b w:val="false"/>
+                <w:bCs w:val="false"/>
+                <w:i w:val="false"/>
+                <w:iCs w:val="false"/>
+                <w:sz w:val="19"/>
+                <w:szCs w:val="19"/>
+              </w:rPr>
+              <w:t xml:space="preserve">Intensidade de uso digital crítico noturno (22h–6h).</w:t>
+            </w:r>
+          </w:p>
+        </w:tc>
+      </w:tr>
+      <w:tr>
+        <w:tc>
+          <w:tcPr>
+            <w:tcW w:type="dxa" w:w="2100"/>
+            <w:tcBorders>
+              <w:top w:val="single" w:color="CCCCCC" w:sz="4"/>
+              <w:left w:val="single" w:color="CCCCCC" w:sz="4"/>
+              <w:bottom w:val="single" w:color="CCCCCC" w:sz="4"/>
+              <w:right w:val="single" w:color="CCCCCC" w:sz="4"/>
+            </w:tcBorders>
+            <w:tcMar>
+              <w:top w:type="dxa" w:w="100"/>
+              <w:left w:type="dxa" w:w="120"/>
+              <w:bottom w:type="dxa" w:w="100"/>
+              <w:right w:type="dxa" w:w="120"/>
+            </w:tcMar>
+            <w:vAlign w:val="center"/>
+          </w:tcPr>
+          <w:p>
+            <w:pPr>
+              <w:jc w:val="left"/>
+            </w:pPr>
+            <w:r>
+              <w:rPr>
+                <w:b/>
+                <w:bCs/>
+                <w:i w:val="false"/>
+                <w:iCs w:val="false"/>
+                <w:sz w:val="19"/>
+                <w:szCs w:val="19"/>
+              </w:rPr>
+              <w:t xml:space="preserve">Verificação Compulsiva</w:t>
+            </w:r>
+          </w:p>
+        </w:tc>
+        <w:tc>
+          <w:tcPr>
+            <w:tcW w:type="dxa" w:w="1500"/>
+            <w:tcBorders>
+              <w:top w:val="single" w:color="CCCCCC" w:sz="4"/>
+              <w:left w:val="single" w:color="CCCCCC" w:sz="4"/>
+              <w:bottom w:val="single" w:color="CCCCCC" w:sz="4"/>
+              <w:right w:val="single" w:color="CCCCCC" w:sz="4"/>
+            </w:tcBorders>
+            <w:tcMar>
+              <w:top w:type="dxa" w:w="100"/>
+              <w:left w:type="dxa" w:w="120"/>
+              <w:bottom w:type="dxa" w:w="100"/>
+              <w:right w:type="dxa" w:w="120"/>
+            </w:tcMar>
+            <w:vAlign w:val="center"/>
+          </w:tcPr>
+          <w:p>
+            <w:pPr>
+              <w:jc w:val="left"/>
+            </w:pPr>
+            <w:r>
+              <w:rPr>
+                <w:b w:val="false"/>
+                <w:bCs w:val="false"/>
+                <w:i w:val="false"/>
+                <w:iCs w:val="false"/>
+                <w:color w:val="4A6A8A"/>
+                <w:sz w:val="19"/>
+                <w:szCs w:val="19"/>
+              </w:rPr>
+              <w:t xml:space="preserve">Indicador</w:t>
+            </w:r>
+          </w:p>
+        </w:tc>
+        <w:tc>
+          <w:tcPr>
+            <w:tcW w:type="dxa" w:w="5760"/>
+            <w:tcBorders>
+              <w:top w:val="single" w:color="CCCCCC" w:sz="4"/>
+              <w:left w:val="single" w:color="CCCCCC" w:sz="4"/>
+              <w:bottom w:val="single" w:color="CCCCCC" w:sz="4"/>
+              <w:right w:val="single" w:color="CCCCCC" w:sz="4"/>
+            </w:tcBorders>
+            <w:tcMar>
+              <w:top w:type="dxa" w:w="100"/>
+              <w:left w:type="dxa" w:w="120"/>
+              <w:bottom w:type="dxa" w:w="100"/>
+              <w:right w:type="dxa" w:w="120"/>
+            </w:tcMar>
+            <w:vAlign w:val="center"/>
+          </w:tcPr>
+          <w:p>
+            <w:pPr>
+              <w:jc w:val="left"/>
+            </w:pPr>
+            <w:r>
+              <w:rPr>
+                <w:b w:val="false"/>
+                <w:bCs w:val="false"/>
+                <w:i w:val="false"/>
+                <w:iCs w:val="false"/>
+                <w:sz w:val="19"/>
+                <w:szCs w:val="19"/>
+              </w:rPr>
+              <w:t xml:space="preserve">Frequência e brevidade de sessões, associada a circuitos dopaminérgicos na literatura citada.</w:t>
+            </w:r>
+          </w:p>
+        </w:tc>
+      </w:tr>
+    </w:tbl>
+    <w:p>
+      <w:pPr>
+        <w:spacing w:after="0" w:before="0"/>
+        <w:jc w:val="both"/>
+      </w:pPr>
+      <w:r>
+        <w:rPr>
+          <w:b w:val="false"/>
+          <w:bCs w:val="false"/>
+          <w:i w:val="false"/>
+          <w:iCs w:val="false"/>
+        </w:rPr>
+        <w:t xml:space="preserve">Termos institucionais recorrentes em toda a série de documentos da Lounge de Soluções ISP (RAG, LGPD) seguem a mesma definição em todos os Product Reports desta série, por força do padrão de documentação da Vísent (docs/PADRAO_DOCUMENTACAO_PRODUTO.md).</w:t>
+      </w:r>
+    </w:p>
     <w:sectPr>
       <w:headerReference w:type="default" r:id="rId9"/>
       <w:footerReference w:type="default" r:id="rId10"/>

</xml_diff>